<commit_message>
docs: convert ASCII diagrams to Mermaid in architecture lecture PPT
Convert architecture diagrams from ASCII art to Mermaid format for better readability and rendering in DOCX export.

Changes:
- Architecture design flow diagram
- MySQL architecture diagram
- SQLRustGo version roadmap mindmap
- v1.0 initial architecture diagram
- v1.2 modular refactoring comparison diagram
- 2.x elastic architecture diagram
- RAG architecture diagram
- Elastic architecture advantages diagram
- Four-layer architecture diagram
</commit_message>
<xml_diff>
--- a/docs/tutorials/教学计划/PPT/第5讲-架构设计原理与SQLRustGo架构.docx
+++ b/docs/tutorials/教学计划/PPT/第5讲-架构设计原理与SQLRustGo架构.docx
@@ -1758,234 +1758,309 @@
         <w:rPr>
           <w:rStyle w:val="VerbatimChar"/>
         </w:rPr>
-        <w:t xml:space="preserve">┌─────────────┐    ┌─────────────┐    ┌─────────────┐    ┌─────────────┐    ┌─────────────┐</w:t>
-      </w:r>
-      <w:r>
-        <w:br/>
-      </w:r>
-      <w:r>
-        <w:rPr>
-          <w:rStyle w:val="VerbatimChar"/>
-        </w:rPr>
-        <w:t xml:space="preserve">│  </w:t>
-      </w:r>
-      <w:r>
-        <w:rPr>
-          <w:rStyle w:val="VerbatimChar"/>
-          <w:rFonts w:hint="eastAsia"/>
-        </w:rPr>
-        <w:t xml:space="preserve">需求分析</w:t>
-      </w:r>
-      <w:r>
-        <w:rPr>
-          <w:rStyle w:val="VerbatimChar"/>
-        </w:rPr>
-        <w:t xml:space="preserve">   │ -&gt; │  </w:t>
-      </w:r>
-      <w:r>
-        <w:rPr>
-          <w:rStyle w:val="VerbatimChar"/>
-          <w:rFonts w:hint="eastAsia"/>
-        </w:rPr>
-        <w:t xml:space="preserve">架构选型</w:t>
-      </w:r>
-      <w:r>
-        <w:rPr>
-          <w:rStyle w:val="VerbatimChar"/>
-        </w:rPr>
-        <w:t xml:space="preserve">   │ -&gt; │  </w:t>
-      </w:r>
-      <w:r>
-        <w:rPr>
-          <w:rStyle w:val="VerbatimChar"/>
-          <w:rFonts w:hint="eastAsia"/>
-        </w:rPr>
-        <w:t xml:space="preserve">组件设计</w:t>
-      </w:r>
-      <w:r>
-        <w:rPr>
-          <w:rStyle w:val="VerbatimChar"/>
-        </w:rPr>
-        <w:t xml:space="preserve">   │ -&gt; │  </w:t>
-      </w:r>
-      <w:r>
-        <w:rPr>
-          <w:rStyle w:val="VerbatimChar"/>
-          <w:rFonts w:hint="eastAsia"/>
-        </w:rPr>
-        <w:t xml:space="preserve">架构评估</w:t>
-      </w:r>
-      <w:r>
-        <w:rPr>
-          <w:rStyle w:val="VerbatimChar"/>
-        </w:rPr>
-        <w:t xml:space="preserve">   │ -&gt; │  </w:t>
-      </w:r>
-      <w:r>
-        <w:rPr>
-          <w:rStyle w:val="VerbatimChar"/>
-          <w:rFonts w:hint="eastAsia"/>
-        </w:rPr>
-        <w:t xml:space="preserve">迭代优化</w:t>
-      </w:r>
-      <w:r>
-        <w:rPr>
-          <w:rStyle w:val="VerbatimChar"/>
-        </w:rPr>
-        <w:t xml:space="preserve">   │</w:t>
-      </w:r>
-      <w:r>
-        <w:br/>
-      </w:r>
-      <w:r>
-        <w:rPr>
-          <w:rStyle w:val="VerbatimChar"/>
-        </w:rPr>
-        <w:t xml:space="preserve">│             │    │             │    │             │    │             │    │             │</w:t>
-      </w:r>
-      <w:r>
-        <w:br/>
-      </w:r>
-      <w:r>
-        <w:rPr>
-          <w:rStyle w:val="VerbatimChar"/>
-        </w:rPr>
-        <w:t xml:space="preserve">│ </w:t>
-      </w:r>
-      <w:r>
-        <w:rPr>
-          <w:rStyle w:val="VerbatimChar"/>
-          <w:rFonts w:hint="eastAsia"/>
-        </w:rPr>
-        <w:t xml:space="preserve">业务需求</w:t>
-      </w:r>
-      <w:r>
-        <w:rPr>
-          <w:rStyle w:val="VerbatimChar"/>
-        </w:rPr>
-        <w:t xml:space="preserve">    │    │ </w:t>
-      </w:r>
-      <w:r>
-        <w:rPr>
-          <w:rStyle w:val="VerbatimChar"/>
-          <w:rFonts w:hint="eastAsia"/>
-        </w:rPr>
-        <w:t xml:space="preserve">风格选择</w:t>
-      </w:r>
-      <w:r>
-        <w:rPr>
-          <w:rStyle w:val="VerbatimChar"/>
-        </w:rPr>
-        <w:t xml:space="preserve">    │    │ </w:t>
-      </w:r>
-      <w:r>
-        <w:rPr>
-          <w:rStyle w:val="VerbatimChar"/>
-          <w:rFonts w:hint="eastAsia"/>
-        </w:rPr>
-        <w:t xml:space="preserve">接口定义</w:t>
-      </w:r>
-      <w:r>
-        <w:rPr>
-          <w:rStyle w:val="VerbatimChar"/>
-        </w:rPr>
-        <w:t xml:space="preserve">    │    │ ATAM/SAAM  │    │ </w:t>
-      </w:r>
-      <w:r>
-        <w:rPr>
-          <w:rStyle w:val="VerbatimChar"/>
-          <w:rFonts w:hint="eastAsia"/>
-        </w:rPr>
-        <w:t xml:space="preserve">持续改进</w:t>
-      </w:r>
-      <w:r>
-        <w:rPr>
-          <w:rStyle w:val="VerbatimChar"/>
-        </w:rPr>
-        <w:t xml:space="preserve">    │</w:t>
-      </w:r>
-      <w:r>
-        <w:br/>
-      </w:r>
-      <w:r>
-        <w:rPr>
-          <w:rStyle w:val="VerbatimChar"/>
-        </w:rPr>
-        <w:t xml:space="preserve">│ </w:t>
-      </w:r>
-      <w:r>
-        <w:rPr>
-          <w:rStyle w:val="VerbatimChar"/>
-          <w:rFonts w:hint="eastAsia"/>
-        </w:rPr>
-        <w:t xml:space="preserve">技术约束</w:t>
-      </w:r>
-      <w:r>
-        <w:rPr>
-          <w:rStyle w:val="VerbatimChar"/>
-        </w:rPr>
-        <w:t xml:space="preserve">    │    │ </w:t>
-      </w:r>
-      <w:r>
-        <w:rPr>
-          <w:rStyle w:val="VerbatimChar"/>
-          <w:rFonts w:hint="eastAsia"/>
-        </w:rPr>
-        <w:t xml:space="preserve">模式选择</w:t>
-      </w:r>
-      <w:r>
-        <w:rPr>
-          <w:rStyle w:val="VerbatimChar"/>
-        </w:rPr>
-        <w:t xml:space="preserve">    │    │ </w:t>
-      </w:r>
-      <w:r>
-        <w:rPr>
-          <w:rStyle w:val="VerbatimChar"/>
-          <w:rFonts w:hint="eastAsia"/>
-        </w:rPr>
-        <w:t xml:space="preserve">依赖关系</w:t>
-      </w:r>
-      <w:r>
-        <w:rPr>
-          <w:rStyle w:val="VerbatimChar"/>
-        </w:rPr>
-        <w:t xml:space="preserve">    │    │ </w:t>
-      </w:r>
-      <w:r>
-        <w:rPr>
-          <w:rStyle w:val="VerbatimChar"/>
-          <w:rFonts w:hint="eastAsia"/>
-        </w:rPr>
-        <w:t xml:space="preserve">风险分析</w:t>
-      </w:r>
-      <w:r>
-        <w:rPr>
-          <w:rStyle w:val="VerbatimChar"/>
-        </w:rPr>
-        <w:t xml:space="preserve">    │    │ </w:t>
-      </w:r>
-      <w:r>
-        <w:rPr>
-          <w:rStyle w:val="VerbatimChar"/>
-          <w:rFonts w:hint="eastAsia"/>
-        </w:rPr>
-        <w:t xml:space="preserve">重构调整</w:t>
-      </w:r>
-      <w:r>
-        <w:rPr>
-          <w:rStyle w:val="VerbatimChar"/>
-        </w:rPr>
-        <w:t xml:space="preserve">    │</w:t>
-      </w:r>
-      <w:r>
-        <w:br/>
-      </w:r>
-      <w:r>
-        <w:rPr>
-          <w:rStyle w:val="VerbatimChar"/>
-        </w:rPr>
-        <w:t xml:space="preserve">└─────────────┘    └─────────────┘    └─────────────┘    └─────────────┘    └─────────────┘</w:t>
+        <w:t xml:space="preserve">flowchart LR</w:t>
+      </w:r>
+      <w:r>
+        <w:br/>
+      </w:r>
+      <w:r>
+        <w:rPr>
+          <w:rStyle w:val="VerbatimChar"/>
+        </w:rPr>
+        <w:t xml:space="preserve">    subgraph </w:t>
+      </w:r>
+      <w:r>
+        <w:rPr>
+          <w:rStyle w:val="VerbatimChar"/>
+          <w:rFonts w:hint="eastAsia"/>
+        </w:rPr>
+        <w:t xml:space="preserve">Phase1["需求分析"]</w:t>
+      </w:r>
+      <w:r>
+        <w:br/>
+      </w:r>
+      <w:r>
+        <w:rPr>
+          <w:rStyle w:val="VerbatimChar"/>
+        </w:rPr>
+        <w:t xml:space="preserve">        </w:t>
+      </w:r>
+      <w:r>
+        <w:rPr>
+          <w:rStyle w:val="VerbatimChar"/>
+          <w:rFonts w:hint="eastAsia"/>
+        </w:rPr>
+        <w:t xml:space="preserve">A1[业务需求]</w:t>
+      </w:r>
+      <w:r>
+        <w:br/>
+      </w:r>
+      <w:r>
+        <w:rPr>
+          <w:rStyle w:val="VerbatimChar"/>
+        </w:rPr>
+        <w:t xml:space="preserve">        </w:t>
+      </w:r>
+      <w:r>
+        <w:rPr>
+          <w:rStyle w:val="VerbatimChar"/>
+          <w:rFonts w:hint="eastAsia"/>
+        </w:rPr>
+        <w:t xml:space="preserve">A2[技术约束]</w:t>
+      </w:r>
+      <w:r>
+        <w:br/>
+      </w:r>
+      <w:r>
+        <w:rPr>
+          <w:rStyle w:val="VerbatimChar"/>
+        </w:rPr>
+        <w:t xml:space="preserve">    end</w:t>
+      </w:r>
+      <w:r>
+        <w:br/>
+      </w:r>
+      <w:r>
+        <w:br/>
+      </w:r>
+      <w:r>
+        <w:rPr>
+          <w:rStyle w:val="VerbatimChar"/>
+        </w:rPr>
+        <w:t xml:space="preserve">    subgraph </w:t>
+      </w:r>
+      <w:r>
+        <w:rPr>
+          <w:rStyle w:val="VerbatimChar"/>
+          <w:rFonts w:hint="eastAsia"/>
+        </w:rPr>
+        <w:t xml:space="preserve">Phase2["架构选型"]</w:t>
+      </w:r>
+      <w:r>
+        <w:br/>
+      </w:r>
+      <w:r>
+        <w:rPr>
+          <w:rStyle w:val="VerbatimChar"/>
+        </w:rPr>
+        <w:t xml:space="preserve">        </w:t>
+      </w:r>
+      <w:r>
+        <w:rPr>
+          <w:rStyle w:val="VerbatimChar"/>
+          <w:rFonts w:hint="eastAsia"/>
+        </w:rPr>
+        <w:t xml:space="preserve">B1[风格选择]</w:t>
+      </w:r>
+      <w:r>
+        <w:br/>
+      </w:r>
+      <w:r>
+        <w:rPr>
+          <w:rStyle w:val="VerbatimChar"/>
+        </w:rPr>
+        <w:t xml:space="preserve">        </w:t>
+      </w:r>
+      <w:r>
+        <w:rPr>
+          <w:rStyle w:val="VerbatimChar"/>
+          <w:rFonts w:hint="eastAsia"/>
+        </w:rPr>
+        <w:t xml:space="preserve">B2[模式选择]</w:t>
+      </w:r>
+      <w:r>
+        <w:br/>
+      </w:r>
+      <w:r>
+        <w:rPr>
+          <w:rStyle w:val="VerbatimChar"/>
+        </w:rPr>
+        <w:t xml:space="preserve">    end</w:t>
+      </w:r>
+      <w:r>
+        <w:br/>
+      </w:r>
+      <w:r>
+        <w:br/>
+      </w:r>
+      <w:r>
+        <w:rPr>
+          <w:rStyle w:val="VerbatimChar"/>
+        </w:rPr>
+        <w:t xml:space="preserve">    subgraph </w:t>
+      </w:r>
+      <w:r>
+        <w:rPr>
+          <w:rStyle w:val="VerbatimChar"/>
+          <w:rFonts w:hint="eastAsia"/>
+        </w:rPr>
+        <w:t xml:space="preserve">Phase3["组件设计"]</w:t>
+      </w:r>
+      <w:r>
+        <w:br/>
+      </w:r>
+      <w:r>
+        <w:rPr>
+          <w:rStyle w:val="VerbatimChar"/>
+        </w:rPr>
+        <w:t xml:space="preserve">        </w:t>
+      </w:r>
+      <w:r>
+        <w:rPr>
+          <w:rStyle w:val="VerbatimChar"/>
+          <w:rFonts w:hint="eastAsia"/>
+        </w:rPr>
+        <w:t xml:space="preserve">C1[接口定义]</w:t>
+      </w:r>
+      <w:r>
+        <w:br/>
+      </w:r>
+      <w:r>
+        <w:rPr>
+          <w:rStyle w:val="VerbatimChar"/>
+        </w:rPr>
+        <w:t xml:space="preserve">        </w:t>
+      </w:r>
+      <w:r>
+        <w:rPr>
+          <w:rStyle w:val="VerbatimChar"/>
+          <w:rFonts w:hint="eastAsia"/>
+        </w:rPr>
+        <w:t xml:space="preserve">C2[依赖关系]</w:t>
+      </w:r>
+      <w:r>
+        <w:br/>
+      </w:r>
+      <w:r>
+        <w:rPr>
+          <w:rStyle w:val="VerbatimChar"/>
+        </w:rPr>
+        <w:t xml:space="preserve">    end</w:t>
+      </w:r>
+      <w:r>
+        <w:br/>
+      </w:r>
+      <w:r>
+        <w:br/>
+      </w:r>
+      <w:r>
+        <w:rPr>
+          <w:rStyle w:val="VerbatimChar"/>
+        </w:rPr>
+        <w:t xml:space="preserve">    subgraph </w:t>
+      </w:r>
+      <w:r>
+        <w:rPr>
+          <w:rStyle w:val="VerbatimChar"/>
+          <w:rFonts w:hint="eastAsia"/>
+        </w:rPr>
+        <w:t xml:space="preserve">Phase4["架构评估"]</w:t>
+      </w:r>
+      <w:r>
+        <w:br/>
+      </w:r>
+      <w:r>
+        <w:rPr>
+          <w:rStyle w:val="VerbatimChar"/>
+        </w:rPr>
+        <w:t xml:space="preserve">        D1[ATAM/SAAM]</w:t>
+      </w:r>
+      <w:r>
+        <w:br/>
+      </w:r>
+      <w:r>
+        <w:rPr>
+          <w:rStyle w:val="VerbatimChar"/>
+        </w:rPr>
+        <w:t xml:space="preserve">        </w:t>
+      </w:r>
+      <w:r>
+        <w:rPr>
+          <w:rStyle w:val="VerbatimChar"/>
+          <w:rFonts w:hint="eastAsia"/>
+        </w:rPr>
+        <w:t xml:space="preserve">D2[风险分析]</w:t>
+      </w:r>
+      <w:r>
+        <w:br/>
+      </w:r>
+      <w:r>
+        <w:rPr>
+          <w:rStyle w:val="VerbatimChar"/>
+        </w:rPr>
+        <w:t xml:space="preserve">    end</w:t>
+      </w:r>
+      <w:r>
+        <w:br/>
+      </w:r>
+      <w:r>
+        <w:br/>
+      </w:r>
+      <w:r>
+        <w:rPr>
+          <w:rStyle w:val="VerbatimChar"/>
+        </w:rPr>
+        <w:t xml:space="preserve">    subgraph </w:t>
+      </w:r>
+      <w:r>
+        <w:rPr>
+          <w:rStyle w:val="VerbatimChar"/>
+          <w:rFonts w:hint="eastAsia"/>
+        </w:rPr>
+        <w:t xml:space="preserve">Phase5["迭代优化"]</w:t>
+      </w:r>
+      <w:r>
+        <w:br/>
+      </w:r>
+      <w:r>
+        <w:rPr>
+          <w:rStyle w:val="VerbatimChar"/>
+        </w:rPr>
+        <w:t xml:space="preserve">        </w:t>
+      </w:r>
+      <w:r>
+        <w:rPr>
+          <w:rStyle w:val="VerbatimChar"/>
+          <w:rFonts w:hint="eastAsia"/>
+        </w:rPr>
+        <w:t xml:space="preserve">E1[持续改进]</w:t>
+      </w:r>
+      <w:r>
+        <w:br/>
+      </w:r>
+      <w:r>
+        <w:rPr>
+          <w:rStyle w:val="VerbatimChar"/>
+        </w:rPr>
+        <w:t xml:space="preserve">        </w:t>
+      </w:r>
+      <w:r>
+        <w:rPr>
+          <w:rStyle w:val="VerbatimChar"/>
+          <w:rFonts w:hint="eastAsia"/>
+        </w:rPr>
+        <w:t xml:space="preserve">E2[重构调整]</w:t>
+      </w:r>
+      <w:r>
+        <w:br/>
+      </w:r>
+      <w:r>
+        <w:rPr>
+          <w:rStyle w:val="VerbatimChar"/>
+        </w:rPr>
+        <w:t xml:space="preserve">    end</w:t>
+      </w:r>
+      <w:r>
+        <w:br/>
+      </w:r>
+      <w:r>
+        <w:br/>
+      </w:r>
+      <w:r>
+        <w:rPr>
+          <w:rStyle w:val="VerbatimChar"/>
+        </w:rPr>
+        <w:t xml:space="preserve">    Phase1 --&gt; Phase2 --&gt; Phase3 --&gt; Phase4 --&gt; Phase5</w:t>
       </w:r>
     </w:p>
     <w:bookmarkEnd w:id="30"/>
@@ -3527,181 +3602,235 @@
         <w:rPr>
           <w:rStyle w:val="VerbatimChar"/>
         </w:rPr>
-        <w:t xml:space="preserve">┌─────────────────────────────────────────────────────────┐</w:t>
-      </w:r>
-      <w:r>
-        <w:br/>
-      </w:r>
-      <w:r>
-        <w:rPr>
-          <w:rStyle w:val="VerbatimChar"/>
-        </w:rPr>
-        <w:t xml:space="preserve">│                    Server Layer                         │</w:t>
-      </w:r>
-      <w:r>
-        <w:br/>
-      </w:r>
-      <w:r>
-        <w:rPr>
-          <w:rStyle w:val="VerbatimChar"/>
-        </w:rPr>
-        <w:t xml:space="preserve">│     Connection Handler → SQL Parser → Optimizer          │</w:t>
-      </w:r>
-      <w:r>
-        <w:br/>
-      </w:r>
-      <w:r>
-        <w:rPr>
-          <w:rStyle w:val="VerbatimChar"/>
-        </w:rPr>
-        <w:t xml:space="preserve">└─────────────────────────────────────────────────────────┘</w:t>
-      </w:r>
-      <w:r>
-        <w:br/>
-      </w:r>
-      <w:r>
-        <w:rPr>
-          <w:rStyle w:val="VerbatimChar"/>
-        </w:rPr>
-        <w:t xml:space="preserve">                          ↓</w:t>
-      </w:r>
-      <w:r>
-        <w:br/>
-      </w:r>
-      <w:r>
-        <w:rPr>
-          <w:rStyle w:val="VerbatimChar"/>
-        </w:rPr>
-        <w:t xml:space="preserve">┌─────────────────────────────────────────────────────────┐</w:t>
-      </w:r>
-      <w:r>
-        <w:br/>
-      </w:r>
-      <w:r>
-        <w:rPr>
-          <w:rStyle w:val="VerbatimChar"/>
-        </w:rPr>
-        <w:t xml:space="preserve">│                    Storage Engine Layer                  │</w:t>
-      </w:r>
-      <w:r>
-        <w:br/>
-      </w:r>
-      <w:r>
-        <w:rPr>
-          <w:rStyle w:val="VerbatimChar"/>
-        </w:rPr>
-        <w:t xml:space="preserve">│  ┌─────────┐ ┌─────────┐ ┌─────────┐ ┌─────────┐      │</w:t>
-      </w:r>
-      <w:r>
-        <w:br/>
-      </w:r>
-      <w:r>
-        <w:rPr>
-          <w:rStyle w:val="VerbatimChar"/>
-        </w:rPr>
-        <w:t xml:space="preserve">│  │ InnoDB  │ │ MyISAM  │ │ Memory  │ │  CSV    │ ...   │</w:t>
-      </w:r>
-      <w:r>
-        <w:br/>
-      </w:r>
-      <w:r>
-        <w:rPr>
-          <w:rStyle w:val="VerbatimChar"/>
-        </w:rPr>
-        <w:t xml:space="preserve">│  └─────────┘ └─────────┘ └─────────┘ └─────────┘        │</w:t>
-      </w:r>
-      <w:r>
-        <w:br/>
-      </w:r>
-      <w:r>
-        <w:rPr>
-          <w:rStyle w:val="VerbatimChar"/>
-        </w:rPr>
-        <w:t xml:space="preserve">└─────────────────────────────────────────────────────────┘</w:t>
-      </w:r>
-      <w:r>
-        <w:br/>
-      </w:r>
-      <w:r>
-        <w:rPr>
-          <w:rStyle w:val="VerbatimChar"/>
-        </w:rPr>
-        <w:t xml:space="preserve">                          ↓</w:t>
-      </w:r>
-      <w:r>
-        <w:br/>
-      </w:r>
-      <w:r>
-        <w:rPr>
-          <w:rStyle w:val="VerbatimChar"/>
-        </w:rPr>
-        <w:t xml:space="preserve">┌─────────────────────────────────────────────────────────┐</w:t>
-      </w:r>
-      <w:r>
-        <w:br/>
-      </w:r>
-      <w:r>
-        <w:rPr>
-          <w:rStyle w:val="VerbatimChar"/>
-        </w:rPr>
-        <w:t xml:space="preserve">│                      File System                         │</w:t>
-      </w:r>
-      <w:r>
-        <w:br/>
-      </w:r>
-      <w:r>
-        <w:rPr>
-          <w:rStyle w:val="VerbatimChar"/>
-        </w:rPr>
-        <w:t xml:space="preserve">│         </w:t>
-      </w:r>
-      <w:r>
-        <w:rPr>
-          <w:rStyle w:val="VerbatimChar"/>
-          <w:rFonts w:hint="eastAsia"/>
-        </w:rPr>
-        <w:t xml:space="preserve">数据文件</w:t>
-      </w:r>
-      <w:r>
-        <w:rPr>
-          <w:rStyle w:val="VerbatimChar"/>
-        </w:rPr>
-        <w:t xml:space="preserve"> / </w:t>
-      </w:r>
-      <w:r>
-        <w:rPr>
-          <w:rStyle w:val="VerbatimChar"/>
-          <w:rFonts w:hint="eastAsia"/>
-        </w:rPr>
-        <w:t xml:space="preserve">索引文件</w:t>
-      </w:r>
-      <w:r>
-        <w:rPr>
-          <w:rStyle w:val="VerbatimChar"/>
-        </w:rPr>
-        <w:t xml:space="preserve"> / </w:t>
-      </w:r>
-      <w:r>
-        <w:rPr>
-          <w:rStyle w:val="VerbatimChar"/>
-          <w:rFonts w:hint="eastAsia"/>
-        </w:rPr>
-        <w:t xml:space="preserve">日志文件</w:t>
-      </w:r>
-      <w:r>
-        <w:rPr>
-          <w:rStyle w:val="VerbatimChar"/>
-        </w:rPr>
-        <w:t xml:space="preserve"> / redo log         │</w:t>
-      </w:r>
-      <w:r>
-        <w:br/>
-      </w:r>
-      <w:r>
-        <w:rPr>
-          <w:rStyle w:val="VerbatimChar"/>
-        </w:rPr>
-        <w:t xml:space="preserve">└─────────────────────────────────────────────────────────┘</w:t>
+        <w:t xml:space="preserve">flowchart TB</w:t>
+      </w:r>
+      <w:r>
+        <w:br/>
+      </w:r>
+      <w:r>
+        <w:rPr>
+          <w:rStyle w:val="VerbatimChar"/>
+        </w:rPr>
+        <w:t xml:space="preserve">    subgraph Server["Server Layer"]</w:t>
+      </w:r>
+      <w:r>
+        <w:br/>
+      </w:r>
+      <w:r>
+        <w:rPr>
+          <w:rStyle w:val="VerbatimChar"/>
+        </w:rPr>
+        <w:t xml:space="preserve">        CH[Connection Handler]</w:t>
+      </w:r>
+      <w:r>
+        <w:br/>
+      </w:r>
+      <w:r>
+        <w:rPr>
+          <w:rStyle w:val="VerbatimChar"/>
+        </w:rPr>
+        <w:t xml:space="preserve">        SP[SQL Parser]</w:t>
+      </w:r>
+      <w:r>
+        <w:br/>
+      </w:r>
+      <w:r>
+        <w:rPr>
+          <w:rStyle w:val="VerbatimChar"/>
+        </w:rPr>
+        <w:t xml:space="preserve">        OPT[Optimizer]</w:t>
+      </w:r>
+      <w:r>
+        <w:br/>
+      </w:r>
+      <w:r>
+        <w:rPr>
+          <w:rStyle w:val="VerbatimChar"/>
+        </w:rPr>
+        <w:t xml:space="preserve">    end</w:t>
+      </w:r>
+      <w:r>
+        <w:br/>
+      </w:r>
+      <w:r>
+        <w:br/>
+      </w:r>
+      <w:r>
+        <w:rPr>
+          <w:rStyle w:val="VerbatimChar"/>
+        </w:rPr>
+        <w:t xml:space="preserve">    subgraph Engine["Storage Engine Layer"]</w:t>
+      </w:r>
+      <w:r>
+        <w:br/>
+      </w:r>
+      <w:r>
+        <w:rPr>
+          <w:rStyle w:val="VerbatimChar"/>
+        </w:rPr>
+        <w:t xml:space="preserve">        subgraph Engines[" "]</w:t>
+      </w:r>
+      <w:r>
+        <w:br/>
+      </w:r>
+      <w:r>
+        <w:rPr>
+          <w:rStyle w:val="VerbatimChar"/>
+        </w:rPr>
+        <w:t xml:space="preserve">            direction LR</w:t>
+      </w:r>
+      <w:r>
+        <w:br/>
+      </w:r>
+      <w:r>
+        <w:rPr>
+          <w:rStyle w:val="VerbatimChar"/>
+        </w:rPr>
+        <w:t xml:space="preserve">            INN[INNODB]</w:t>
+      </w:r>
+      <w:r>
+        <w:br/>
+      </w:r>
+      <w:r>
+        <w:rPr>
+          <w:rStyle w:val="VerbatimChar"/>
+        </w:rPr>
+        <w:t xml:space="preserve">            MYI[MyISAM]</w:t>
+      </w:r>
+      <w:r>
+        <w:br/>
+      </w:r>
+      <w:r>
+        <w:rPr>
+          <w:rStyle w:val="VerbatimChar"/>
+        </w:rPr>
+        <w:t xml:space="preserve">            MEM[Memory]</w:t>
+      </w:r>
+      <w:r>
+        <w:br/>
+      </w:r>
+      <w:r>
+        <w:rPr>
+          <w:rStyle w:val="VerbatimChar"/>
+        </w:rPr>
+        <w:t xml:space="preserve">            CSV[CSV]</w:t>
+      </w:r>
+      <w:r>
+        <w:br/>
+      </w:r>
+      <w:r>
+        <w:rPr>
+          <w:rStyle w:val="VerbatimChar"/>
+        </w:rPr>
+        <w:t xml:space="preserve">        end</w:t>
+      </w:r>
+      <w:r>
+        <w:br/>
+      </w:r>
+      <w:r>
+        <w:rPr>
+          <w:rStyle w:val="VerbatimChar"/>
+        </w:rPr>
+        <w:t xml:space="preserve">    end</w:t>
+      </w:r>
+      <w:r>
+        <w:br/>
+      </w:r>
+      <w:r>
+        <w:br/>
+      </w:r>
+      <w:r>
+        <w:rPr>
+          <w:rStyle w:val="VerbatimChar"/>
+        </w:rPr>
+        <w:t xml:space="preserve">    subgraph FS["File System"]</w:t>
+      </w:r>
+      <w:r>
+        <w:br/>
+      </w:r>
+      <w:r>
+        <w:rPr>
+          <w:rStyle w:val="VerbatimChar"/>
+        </w:rPr>
+        <w:t xml:space="preserve">        </w:t>
+      </w:r>
+      <w:r>
+        <w:rPr>
+          <w:rStyle w:val="VerbatimChar"/>
+          <w:rFonts w:hint="eastAsia"/>
+        </w:rPr>
+        <w:t xml:space="preserve">DF[数据文件]</w:t>
+      </w:r>
+      <w:r>
+        <w:br/>
+      </w:r>
+      <w:r>
+        <w:rPr>
+          <w:rStyle w:val="VerbatimChar"/>
+        </w:rPr>
+        <w:t xml:space="preserve">        </w:t>
+      </w:r>
+      <w:r>
+        <w:rPr>
+          <w:rStyle w:val="VerbatimChar"/>
+          <w:rFonts w:hint="eastAsia"/>
+        </w:rPr>
+        <w:t xml:space="preserve">IF[索引文件]</w:t>
+      </w:r>
+      <w:r>
+        <w:br/>
+      </w:r>
+      <w:r>
+        <w:rPr>
+          <w:rStyle w:val="VerbatimChar"/>
+        </w:rPr>
+        <w:t xml:space="preserve">        </w:t>
+      </w:r>
+      <w:r>
+        <w:rPr>
+          <w:rStyle w:val="VerbatimChar"/>
+          <w:rFonts w:hint="eastAsia"/>
+        </w:rPr>
+        <w:t xml:space="preserve">LF[日志文件]</w:t>
+      </w:r>
+      <w:r>
+        <w:br/>
+      </w:r>
+      <w:r>
+        <w:rPr>
+          <w:rStyle w:val="VerbatimChar"/>
+        </w:rPr>
+        <w:t xml:space="preserve">        RL[Redo Log]</w:t>
+      </w:r>
+      <w:r>
+        <w:br/>
+      </w:r>
+      <w:r>
+        <w:rPr>
+          <w:rStyle w:val="VerbatimChar"/>
+        </w:rPr>
+        <w:t xml:space="preserve">    end</w:t>
+      </w:r>
+      <w:r>
+        <w:br/>
+      </w:r>
+      <w:r>
+        <w:br/>
+      </w:r>
+      <w:r>
+        <w:rPr>
+          <w:rStyle w:val="VerbatimChar"/>
+        </w:rPr>
+        <w:t xml:space="preserve">    Server --&gt; Engine</w:t>
+      </w:r>
+      <w:r>
+        <w:br/>
+      </w:r>
+      <w:r>
+        <w:rPr>
+          <w:rStyle w:val="VerbatimChar"/>
+        </w:rPr>
+        <w:t xml:space="preserve">    Engine --&gt; FS</w:t>
       </w:r>
     </w:p>
     <w:bookmarkEnd w:id="40"/>
@@ -4070,76 +4199,89 @@
         <w:rPr>
           <w:rStyle w:val="VerbatimChar"/>
         </w:rPr>
-        <w:t xml:space="preserve">SQLRustGo</w:t>
-      </w:r>
-      <w:r>
-        <w:br/>
-      </w:r>
-      <w:r>
-        <w:rPr>
-          <w:rStyle w:val="VerbatimChar"/>
-        </w:rPr>
-        <w:t xml:space="preserve">    │</w:t>
-      </w:r>
-      <w:r>
-        <w:br/>
-      </w:r>
-      <w:r>
-        <w:rPr>
-          <w:rStyle w:val="VerbatimChar"/>
-        </w:rPr>
-        <w:t xml:space="preserve">    ├── 1.x </w:t>
-      </w:r>
-      <w:r>
-        <w:rPr>
-          <w:rStyle w:val="VerbatimChar"/>
-          <w:rFonts w:hint="eastAsia"/>
-        </w:rPr>
-        <w:t xml:space="preserve">系列</w:t>
-      </w:r>
-      <w:r>
-        <w:rPr>
-          <w:rStyle w:val="VerbatimChar"/>
-        </w:rPr>
-        <w:t xml:space="preserve"> ─── </w:t>
-      </w:r>
-      <w:r>
-        <w:rPr>
-          <w:rStyle w:val="VerbatimChar"/>
-          <w:rFonts w:hint="eastAsia"/>
-        </w:rPr>
-        <w:t xml:space="preserve">单机数据库（教学到生产）</w:t>
-      </w:r>
-      <w:r>
-        <w:br/>
-      </w:r>
-      <w:r>
-        <w:rPr>
-          <w:rStyle w:val="VerbatimChar"/>
-        </w:rPr>
-        <w:t xml:space="preserve">    │</w:t>
-      </w:r>
-      <w:r>
-        <w:br/>
-      </w:r>
-      <w:r>
-        <w:rPr>
-          <w:rStyle w:val="VerbatimChar"/>
-        </w:rPr>
-        <w:t xml:space="preserve">    ├── 2.x </w:t>
-      </w:r>
-      <w:r>
-        <w:rPr>
-          <w:rStyle w:val="VerbatimChar"/>
-          <w:rFonts w:hint="eastAsia"/>
-        </w:rPr>
-        <w:t xml:space="preserve">系列</w:t>
-      </w:r>
-      <w:r>
-        <w:rPr>
-          <w:rStyle w:val="VerbatimChar"/>
-        </w:rPr>
-        <w:t xml:space="preserve"> ─── </w:t>
+        <w:t xml:space="preserve">mindmap</w:t>
+      </w:r>
+      <w:r>
+        <w:br/>
+      </w:r>
+      <w:r>
+        <w:rPr>
+          <w:rStyle w:val="VerbatimChar"/>
+        </w:rPr>
+        <w:t xml:space="preserve">    root((SQLRustGo))</w:t>
+      </w:r>
+      <w:r>
+        <w:br/>
+      </w:r>
+      <w:r>
+        <w:rPr>
+          <w:rStyle w:val="VerbatimChar"/>
+        </w:rPr>
+        <w:t xml:space="preserve">        </w:t>
+      </w:r>
+      <w:r>
+        <w:rPr>
+          <w:rStyle w:val="VerbatimChar"/>
+          <w:rFonts w:hint="eastAsia"/>
+        </w:rPr>
+        <w:t xml:space="preserve">1.x系列</w:t>
+      </w:r>
+      <w:r>
+        <w:br/>
+      </w:r>
+      <w:r>
+        <w:rPr>
+          <w:rStyle w:val="VerbatimChar"/>
+        </w:rPr>
+        <w:t xml:space="preserve">            </w:t>
+      </w:r>
+      <w:r>
+        <w:rPr>
+          <w:rStyle w:val="VerbatimChar"/>
+          <w:rFonts w:hint="eastAsia"/>
+        </w:rPr>
+        <w:t xml:space="preserve">单机数据库</w:t>
+      </w:r>
+      <w:r>
+        <w:br/>
+      </w:r>
+      <w:r>
+        <w:rPr>
+          <w:rStyle w:val="VerbatimChar"/>
+        </w:rPr>
+        <w:t xml:space="preserve">            </w:t>
+      </w:r>
+      <w:r>
+        <w:rPr>
+          <w:rStyle w:val="VerbatimChar"/>
+          <w:rFonts w:hint="eastAsia"/>
+        </w:rPr>
+        <w:t xml:space="preserve">教学到生产</w:t>
+      </w:r>
+      <w:r>
+        <w:br/>
+      </w:r>
+      <w:r>
+        <w:rPr>
+          <w:rStyle w:val="VerbatimChar"/>
+        </w:rPr>
+        <w:t xml:space="preserve">        </w:t>
+      </w:r>
+      <w:r>
+        <w:rPr>
+          <w:rStyle w:val="VerbatimChar"/>
+          <w:rFonts w:hint="eastAsia"/>
+        </w:rPr>
+        <w:t xml:space="preserve">2.x系列</w:t>
+      </w:r>
+      <w:r>
+        <w:br/>
+      </w:r>
+      <w:r>
+        <w:rPr>
+          <w:rStyle w:val="VerbatimChar"/>
+        </w:rPr>
+        <w:t xml:space="preserve">            </w:t>
       </w:r>
       <w:r>
         <w:rPr>
@@ -4149,10 +4291,22 @@
         <w:t xml:space="preserve">向量数据库</w:t>
       </w:r>
       <w:r>
-        <w:rPr>
-          <w:rStyle w:val="VerbatimChar"/>
-        </w:rPr>
-        <w:t xml:space="preserve"> + RAG + </w:t>
+        <w:br/>
+      </w:r>
+      <w:r>
+        <w:rPr>
+          <w:rStyle w:val="VerbatimChar"/>
+        </w:rPr>
+        <w:t xml:space="preserve">            RAG</w:t>
+      </w:r>
+      <w:r>
+        <w:br/>
+      </w:r>
+      <w:r>
+        <w:rPr>
+          <w:rStyle w:val="VerbatimChar"/>
+        </w:rPr>
+        <w:t xml:space="preserve">            </w:t>
       </w:r>
       <w:r>
         <w:rPr>
@@ -4168,29 +4322,23 @@
         <w:rPr>
           <w:rStyle w:val="VerbatimChar"/>
         </w:rPr>
-        <w:t xml:space="preserve">    │</w:t>
-      </w:r>
-      <w:r>
-        <w:br/>
-      </w:r>
-      <w:r>
-        <w:rPr>
-          <w:rStyle w:val="VerbatimChar"/>
-        </w:rPr>
-        <w:t xml:space="preserve">    ├── 3.x </w:t>
-      </w:r>
-      <w:r>
-        <w:rPr>
-          <w:rStyle w:val="VerbatimChar"/>
-          <w:rFonts w:hint="eastAsia"/>
-        </w:rPr>
-        <w:t xml:space="preserve">系列</w:t>
-      </w:r>
-      <w:r>
-        <w:rPr>
-          <w:rStyle w:val="VerbatimChar"/>
-        </w:rPr>
-        <w:t xml:space="preserve"> ─── </w:t>
+        <w:t xml:space="preserve">        </w:t>
+      </w:r>
+      <w:r>
+        <w:rPr>
+          <w:rStyle w:val="VerbatimChar"/>
+          <w:rFonts w:hint="eastAsia"/>
+        </w:rPr>
+        <w:t xml:space="preserve">3.x系列</w:t>
+      </w:r>
+      <w:r>
+        <w:br/>
+      </w:r>
+      <w:r>
+        <w:rPr>
+          <w:rStyle w:val="VerbatimChar"/>
+        </w:rPr>
+        <w:t xml:space="preserve">            </w:t>
       </w:r>
       <w:r>
         <w:rPr>
@@ -4206,29 +4354,23 @@
         <w:rPr>
           <w:rStyle w:val="VerbatimChar"/>
         </w:rPr>
-        <w:t xml:space="preserve">    │</w:t>
-      </w:r>
-      <w:r>
-        <w:br/>
-      </w:r>
-      <w:r>
-        <w:rPr>
-          <w:rStyle w:val="VerbatimChar"/>
-        </w:rPr>
-        <w:t xml:space="preserve">    └── 4.x </w:t>
-      </w:r>
-      <w:r>
-        <w:rPr>
-          <w:rStyle w:val="VerbatimChar"/>
-          <w:rFonts w:hint="eastAsia"/>
-        </w:rPr>
-        <w:t xml:space="preserve">系列</w:t>
-      </w:r>
-      <w:r>
-        <w:rPr>
-          <w:rStyle w:val="VerbatimChar"/>
-        </w:rPr>
-        <w:t xml:space="preserve"> ─── </w:t>
+        <w:t xml:space="preserve">        </w:t>
+      </w:r>
+      <w:r>
+        <w:rPr>
+          <w:rStyle w:val="VerbatimChar"/>
+          <w:rFonts w:hint="eastAsia"/>
+        </w:rPr>
+        <w:t xml:space="preserve">4.x系列</w:t>
+      </w:r>
+      <w:r>
+        <w:br/>
+      </w:r>
+      <w:r>
+        <w:rPr>
+          <w:rStyle w:val="VerbatimChar"/>
+        </w:rPr>
+        <w:t xml:space="preserve">            </w:t>
       </w:r>
       <w:r>
         <w:rPr>
@@ -5477,137 +5619,140 @@
         <w:rPr>
           <w:rStyle w:val="VerbatimChar"/>
         </w:rPr>
-        <w:t xml:space="preserve">┌─────────────────────────────────────────────────────────┐</w:t>
-      </w:r>
-      <w:r>
-        <w:br/>
-      </w:r>
-      <w:r>
-        <w:rPr>
-          <w:rStyle w:val="VerbatimChar"/>
-        </w:rPr>
-        <w:t xml:space="preserve">│                    Parser Layer                          │</w:t>
-      </w:r>
-      <w:r>
-        <w:br/>
-      </w:r>
-      <w:r>
-        <w:rPr>
-          <w:rStyle w:val="VerbatimChar"/>
-        </w:rPr>
-        <w:t xml:space="preserve">│              Lexer → Parser → AST                        │</w:t>
-      </w:r>
-      <w:r>
-        <w:br/>
-      </w:r>
-      <w:r>
-        <w:rPr>
-          <w:rStyle w:val="VerbatimChar"/>
-        </w:rPr>
-        <w:t xml:space="preserve">└─────────────────────────────────────────────────────────┘</w:t>
-      </w:r>
-      <w:r>
-        <w:br/>
-      </w:r>
-      <w:r>
-        <w:rPr>
-          <w:rStyle w:val="VerbatimChar"/>
-        </w:rPr>
-        <w:t xml:space="preserve">                          ↓</w:t>
-      </w:r>
-      <w:r>
-        <w:br/>
-      </w:r>
-      <w:r>
-        <w:rPr>
-          <w:rStyle w:val="VerbatimChar"/>
-        </w:rPr>
-        <w:t xml:space="preserve">┌─────────────────────────────────────────────────────────┐</w:t>
-      </w:r>
-      <w:r>
-        <w:br/>
-      </w:r>
-      <w:r>
-        <w:rPr>
-          <w:rStyle w:val="VerbatimChar"/>
-        </w:rPr>
-        <w:t xml:space="preserve">│                    Executor Layer                        │</w:t>
-      </w:r>
-      <w:r>
-        <w:br/>
-      </w:r>
-      <w:r>
-        <w:rPr>
-          <w:rStyle w:val="VerbatimChar"/>
-        </w:rPr>
-        <w:t xml:space="preserve">│              </w:t>
-      </w:r>
-      <w:r>
-        <w:rPr>
-          <w:rStyle w:val="VerbatimChar"/>
-          <w:rFonts w:hint="eastAsia"/>
-        </w:rPr>
-        <w:t xml:space="preserve">简单火山模型执行器</w:t>
-      </w:r>
-      <w:r>
-        <w:rPr>
-          <w:rStyle w:val="VerbatimChar"/>
-        </w:rPr>
-        <w:t xml:space="preserve">                           │</w:t>
-      </w:r>
-      <w:r>
-        <w:br/>
-      </w:r>
-      <w:r>
-        <w:rPr>
-          <w:rStyle w:val="VerbatimChar"/>
-        </w:rPr>
-        <w:t xml:space="preserve">└─────────────────────────────────────────────────────────┘</w:t>
-      </w:r>
-      <w:r>
-        <w:br/>
-      </w:r>
-      <w:r>
-        <w:rPr>
-          <w:rStyle w:val="VerbatimChar"/>
-        </w:rPr>
-        <w:t xml:space="preserve">                          ↓</w:t>
-      </w:r>
-      <w:r>
-        <w:br/>
-      </w:r>
-      <w:r>
-        <w:rPr>
-          <w:rStyle w:val="VerbatimChar"/>
-        </w:rPr>
-        <w:t xml:space="preserve">┌─────────────────────────────────────────────────────────┐</w:t>
-      </w:r>
-      <w:r>
-        <w:br/>
-      </w:r>
-      <w:r>
-        <w:rPr>
-          <w:rStyle w:val="VerbatimChar"/>
-        </w:rPr>
-        <w:t xml:space="preserve">│                    Storage Layer                         │</w:t>
-      </w:r>
-      <w:r>
-        <w:br/>
-      </w:r>
-      <w:r>
-        <w:rPr>
-          <w:rStyle w:val="VerbatimChar"/>
-        </w:rPr>
-        <w:t xml:space="preserve">│                   Memory Storage                         │</w:t>
-      </w:r>
-      <w:r>
-        <w:br/>
-      </w:r>
-      <w:r>
-        <w:rPr>
-          <w:rStyle w:val="VerbatimChar"/>
-        </w:rPr>
-        <w:t xml:space="preserve">└─────────────────────────────────────────────────────────┘</w:t>
+        <w:t xml:space="preserve">flowchart TB</w:t>
+      </w:r>
+      <w:r>
+        <w:br/>
+      </w:r>
+      <w:r>
+        <w:rPr>
+          <w:rStyle w:val="VerbatimChar"/>
+        </w:rPr>
+        <w:t xml:space="preserve">    subgraph Parser["Parser Layer"]</w:t>
+      </w:r>
+      <w:r>
+        <w:br/>
+      </w:r>
+      <w:r>
+        <w:rPr>
+          <w:rStyle w:val="VerbatimChar"/>
+        </w:rPr>
+        <w:t xml:space="preserve">        L[Lexer]</w:t>
+      </w:r>
+      <w:r>
+        <w:br/>
+      </w:r>
+      <w:r>
+        <w:rPr>
+          <w:rStyle w:val="VerbatimChar"/>
+        </w:rPr>
+        <w:t xml:space="preserve">        P[Parser]</w:t>
+      </w:r>
+      <w:r>
+        <w:br/>
+      </w:r>
+      <w:r>
+        <w:rPr>
+          <w:rStyle w:val="VerbatimChar"/>
+        </w:rPr>
+        <w:t xml:space="preserve">        A[AST]</w:t>
+      </w:r>
+      <w:r>
+        <w:br/>
+      </w:r>
+      <w:r>
+        <w:rPr>
+          <w:rStyle w:val="VerbatimChar"/>
+        </w:rPr>
+        <w:t xml:space="preserve">        L --&gt; P --&gt; A</w:t>
+      </w:r>
+      <w:r>
+        <w:br/>
+      </w:r>
+      <w:r>
+        <w:rPr>
+          <w:rStyle w:val="VerbatimChar"/>
+        </w:rPr>
+        <w:t xml:space="preserve">    end</w:t>
+      </w:r>
+      <w:r>
+        <w:br/>
+      </w:r>
+      <w:r>
+        <w:br/>
+      </w:r>
+      <w:r>
+        <w:rPr>
+          <w:rStyle w:val="VerbatimChar"/>
+        </w:rPr>
+        <w:t xml:space="preserve">    subgraph Executor["Executor Layer"]</w:t>
+      </w:r>
+      <w:r>
+        <w:br/>
+      </w:r>
+      <w:r>
+        <w:rPr>
+          <w:rStyle w:val="VerbatimChar"/>
+        </w:rPr>
+        <w:t xml:space="preserve">        </w:t>
+      </w:r>
+      <w:r>
+        <w:rPr>
+          <w:rStyle w:val="VerbatimChar"/>
+          <w:rFonts w:hint="eastAsia"/>
+        </w:rPr>
+        <w:t xml:space="preserve">E[简单火山模型执行器]</w:t>
+      </w:r>
+      <w:r>
+        <w:br/>
+      </w:r>
+      <w:r>
+        <w:rPr>
+          <w:rStyle w:val="VerbatimChar"/>
+        </w:rPr>
+        <w:t xml:space="preserve">    end</w:t>
+      </w:r>
+      <w:r>
+        <w:br/>
+      </w:r>
+      <w:r>
+        <w:br/>
+      </w:r>
+      <w:r>
+        <w:rPr>
+          <w:rStyle w:val="VerbatimChar"/>
+        </w:rPr>
+        <w:t xml:space="preserve">    subgraph Storage["Storage Layer"]</w:t>
+      </w:r>
+      <w:r>
+        <w:br/>
+      </w:r>
+      <w:r>
+        <w:rPr>
+          <w:rStyle w:val="VerbatimChar"/>
+        </w:rPr>
+        <w:t xml:space="preserve">        M[Memory Storage]</w:t>
+      </w:r>
+      <w:r>
+        <w:br/>
+      </w:r>
+      <w:r>
+        <w:rPr>
+          <w:rStyle w:val="VerbatimChar"/>
+        </w:rPr>
+        <w:t xml:space="preserve">    end</w:t>
+      </w:r>
+      <w:r>
+        <w:br/>
+      </w:r>
+      <w:r>
+        <w:br/>
+      </w:r>
+      <w:r>
+        <w:rPr>
+          <w:rStyle w:val="VerbatimChar"/>
+        </w:rPr>
+        <w:t xml:space="preserve">    Parser --&gt; Executor --&gt; Storage</w:t>
       </w:r>
     </w:p>
     <w:p>
@@ -5895,218 +6040,226 @@
       <w:r>
         <w:rPr>
           <w:rStyle w:val="VerbatimChar"/>
-          <w:rFonts w:hint="eastAsia"/>
-        </w:rPr>
-        <w:t xml:space="preserve">旧架构：</w:t>
-      </w:r>
-      <w:r>
-        <w:br/>
-      </w:r>
-      <w:r>
-        <w:rPr>
-          <w:rStyle w:val="VerbatimChar"/>
-        </w:rPr>
-        <w:t xml:space="preserve">┌──────────────────────────────────────────┐</w:t>
-      </w:r>
-      <w:r>
-        <w:br/>
-      </w:r>
-      <w:r>
-        <w:rPr>
-          <w:rStyle w:val="VerbatimChar"/>
-        </w:rPr>
-        <w:t xml:space="preserve">│            </w:t>
-      </w:r>
-      <w:r>
-        <w:rPr>
-          <w:rStyle w:val="VerbatimChar"/>
-          <w:rFonts w:hint="eastAsia"/>
-        </w:rPr>
-        <w:t xml:space="preserve">单体模块结构</w:t>
-      </w:r>
-      <w:r>
-        <w:rPr>
-          <w:rStyle w:val="VerbatimChar"/>
-        </w:rPr>
-        <w:t xml:space="preserve">                    │</w:t>
-      </w:r>
-      <w:r>
-        <w:br/>
-      </w:r>
-      <w:r>
-        <w:rPr>
-          <w:rStyle w:val="VerbatimChar"/>
-        </w:rPr>
-        <w:t xml:space="preserve">│  parser ↔ planner ↔ executor ↔ storage   │</w:t>
-      </w:r>
-      <w:r>
-        <w:br/>
-      </w:r>
-      <w:r>
-        <w:rPr>
-          <w:rStyle w:val="VerbatimChar"/>
-        </w:rPr>
-        <w:t xml:space="preserve">│  </w:t>
-      </w:r>
-      <w:r>
-        <w:rPr>
-          <w:rStyle w:val="VerbatimChar"/>
-          <w:rFonts w:hint="eastAsia"/>
-        </w:rPr>
-        <w:t xml:space="preserve">所有模块直接依赖，编译时间长，测试困难</w:t>
-      </w:r>
-      <w:r>
-        <w:rPr>
-          <w:rStyle w:val="VerbatimChar"/>
-        </w:rPr>
-        <w:t xml:space="preserve">    │</w:t>
-      </w:r>
-      <w:r>
-        <w:br/>
-      </w:r>
-      <w:r>
-        <w:rPr>
-          <w:rStyle w:val="VerbatimChar"/>
-        </w:rPr>
-        <w:t xml:space="preserve">└──────────────────────────────────────────┘</w:t>
-      </w:r>
-      <w:r>
-        <w:br/>
-      </w:r>
-      <w:r>
-        <w:br/>
-      </w:r>
-      <w:r>
-        <w:rPr>
-          <w:rStyle w:val="VerbatimChar"/>
-          <w:rFonts w:hint="eastAsia"/>
-        </w:rPr>
-        <w:t xml:space="preserve">新架构：</w:t>
-      </w:r>
-      <w:r>
-        <w:br/>
-      </w:r>
-      <w:r>
-        <w:rPr>
-          <w:rStyle w:val="VerbatimChar"/>
-        </w:rPr>
-        <w:t xml:space="preserve">┌─────────────┐  ┌─────────────┐  ┌─────────────┐  ┌─────────────┐</w:t>
-      </w:r>
-      <w:r>
-        <w:br/>
-      </w:r>
-      <w:r>
-        <w:rPr>
-          <w:rStyle w:val="VerbatimChar"/>
-        </w:rPr>
-        <w:t xml:space="preserve">│   parser    │  │   planner    │  │  executor    │  │   storage    │</w:t>
-      </w:r>
-      <w:r>
-        <w:br/>
-      </w:r>
-      <w:r>
-        <w:rPr>
-          <w:rStyle w:val="VerbatimChar"/>
-        </w:rPr>
-        <w:t xml:space="preserve">│   crate     │  │   crate      │  │   crate      │  │   crate      │</w:t>
-      </w:r>
-      <w:r>
-        <w:br/>
-      </w:r>
-      <w:r>
-        <w:rPr>
-          <w:rStyle w:val="VerbatimChar"/>
-        </w:rPr>
-        <w:t xml:space="preserve">└──────┬──────┘  └──────┬──────┘  └──────┬──────┘  └──────┬──────┘</w:t>
-      </w:r>
-      <w:r>
-        <w:br/>
-      </w:r>
-      <w:r>
-        <w:rPr>
-          <w:rStyle w:val="VerbatimChar"/>
-        </w:rPr>
-        <w:t xml:space="preserve">       │                 │                 │                 │</w:t>
-      </w:r>
-      <w:r>
-        <w:br/>
-      </w:r>
-      <w:r>
-        <w:rPr>
-          <w:rStyle w:val="VerbatimChar"/>
-        </w:rPr>
-        <w:t xml:space="preserve">       └─────────────────┴────────┬────────┴─────────────────┘</w:t>
-      </w:r>
-      <w:r>
-        <w:br/>
-      </w:r>
-      <w:r>
-        <w:rPr>
-          <w:rStyle w:val="VerbatimChar"/>
-        </w:rPr>
-        <w:t xml:space="preserve">                                   ↓</w:t>
-      </w:r>
-      <w:r>
-        <w:br/>
-      </w:r>
-      <w:r>
-        <w:rPr>
-          <w:rStyle w:val="VerbatimChar"/>
-        </w:rPr>
-        <w:t xml:space="preserve">                    ┌──────────────────────────────┐</w:t>
-      </w:r>
-      <w:r>
-        <w:br/>
-      </w:r>
-      <w:r>
-        <w:rPr>
-          <w:rStyle w:val="VerbatimChar"/>
-        </w:rPr>
-        <w:t xml:space="preserve">                    │     storage trait </w:t>
-      </w:r>
-      <w:r>
-        <w:rPr>
-          <w:rStyle w:val="VerbatimChar"/>
-          <w:rFonts w:hint="eastAsia"/>
-        </w:rPr>
-        <w:t xml:space="preserve">抽象层</w:t>
-      </w:r>
-      <w:r>
-        <w:rPr>
-          <w:rStyle w:val="VerbatimChar"/>
-        </w:rPr>
-        <w:t xml:space="preserve">      │</w:t>
-      </w:r>
-      <w:r>
-        <w:br/>
-      </w:r>
-      <w:r>
-        <w:rPr>
-          <w:rStyle w:val="VerbatimChar"/>
-        </w:rPr>
-        <w:t xml:space="preserve">                    │  </w:t>
-      </w:r>
-      <w:r>
-        <w:rPr>
-          <w:rStyle w:val="VerbatimChar"/>
-          <w:rFonts w:hint="eastAsia"/>
-        </w:rPr>
-        <w:t xml:space="preserve">(定义存储引擎统一接口)</w:t>
-      </w:r>
-      <w:r>
-        <w:rPr>
-          <w:rStyle w:val="VerbatimChar"/>
-        </w:rPr>
-        <w:t xml:space="preserve">        │</w:t>
-      </w:r>
-      <w:r>
-        <w:br/>
-      </w:r>
-      <w:r>
-        <w:rPr>
-          <w:rStyle w:val="VerbatimChar"/>
-        </w:rPr>
-        <w:t xml:space="preserve">                    └──────────────────────────────┘</w:t>
+        </w:rPr>
+        <w:t xml:space="preserve">flowchart LR</w:t>
+      </w:r>
+      <w:r>
+        <w:br/>
+      </w:r>
+      <w:r>
+        <w:rPr>
+          <w:rStyle w:val="VerbatimChar"/>
+        </w:rPr>
+        <w:t xml:space="preserve">    subgraph </w:t>
+      </w:r>
+      <w:r>
+        <w:rPr>
+          <w:rStyle w:val="VerbatimChar"/>
+          <w:rFonts w:hint="eastAsia"/>
+        </w:rPr>
+        <w:t xml:space="preserve">Old["旧架构：单体模块"]</w:t>
+      </w:r>
+      <w:r>
+        <w:br/>
+      </w:r>
+      <w:r>
+        <w:rPr>
+          <w:rStyle w:val="VerbatimChar"/>
+        </w:rPr>
+        <w:t xml:space="preserve">        O1[parser]</w:t>
+      </w:r>
+      <w:r>
+        <w:br/>
+      </w:r>
+      <w:r>
+        <w:rPr>
+          <w:rStyle w:val="VerbatimChar"/>
+        </w:rPr>
+        <w:t xml:space="preserve">        O2[planner]</w:t>
+      </w:r>
+      <w:r>
+        <w:br/>
+      </w:r>
+      <w:r>
+        <w:rPr>
+          <w:rStyle w:val="VerbatimChar"/>
+        </w:rPr>
+        <w:t xml:space="preserve">        O3[executor]</w:t>
+      </w:r>
+      <w:r>
+        <w:br/>
+      </w:r>
+      <w:r>
+        <w:rPr>
+          <w:rStyle w:val="VerbatimChar"/>
+        </w:rPr>
+        <w:t xml:space="preserve">        O4[storage]</w:t>
+      </w:r>
+      <w:r>
+        <w:br/>
+      </w:r>
+      <w:r>
+        <w:rPr>
+          <w:rStyle w:val="VerbatimChar"/>
+        </w:rPr>
+        <w:t xml:space="preserve">        O1 &lt;--&gt; O2 &lt;--&gt; O3 &lt;--&gt; O4</w:t>
+      </w:r>
+      <w:r>
+        <w:br/>
+      </w:r>
+      <w:r>
+        <w:rPr>
+          <w:rStyle w:val="VerbatimChar"/>
+        </w:rPr>
+        <w:t xml:space="preserve">    end</w:t>
+      </w:r>
+      <w:r>
+        <w:br/>
+      </w:r>
+      <w:r>
+        <w:br/>
+      </w:r>
+      <w:r>
+        <w:rPr>
+          <w:rStyle w:val="VerbatimChar"/>
+        </w:rPr>
+        <w:t xml:space="preserve">    subgraph </w:t>
+      </w:r>
+      <w:r>
+        <w:rPr>
+          <w:rStyle w:val="VerbatimChar"/>
+          <w:rFonts w:hint="eastAsia"/>
+        </w:rPr>
+        <w:t xml:space="preserve">New["新架构：模块化Crate"]</w:t>
+      </w:r>
+      <w:r>
+        <w:br/>
+      </w:r>
+      <w:r>
+        <w:rPr>
+          <w:rStyle w:val="VerbatimChar"/>
+        </w:rPr>
+        <w:t xml:space="preserve">        N1[parser crate]</w:t>
+      </w:r>
+      <w:r>
+        <w:br/>
+      </w:r>
+      <w:r>
+        <w:rPr>
+          <w:rStyle w:val="VerbatimChar"/>
+        </w:rPr>
+        <w:t xml:space="preserve">        N2[planner crate]</w:t>
+      </w:r>
+      <w:r>
+        <w:br/>
+      </w:r>
+      <w:r>
+        <w:rPr>
+          <w:rStyle w:val="VerbatimChar"/>
+        </w:rPr>
+        <w:t xml:space="preserve">        N3[executor crate]</w:t>
+      </w:r>
+      <w:r>
+        <w:br/>
+      </w:r>
+      <w:r>
+        <w:rPr>
+          <w:rStyle w:val="VerbatimChar"/>
+        </w:rPr>
+        <w:t xml:space="preserve">        N4[storage crate]</w:t>
+      </w:r>
+      <w:r>
+        <w:br/>
+      </w:r>
+      <w:r>
+        <w:rPr>
+          <w:rStyle w:val="VerbatimChar"/>
+        </w:rPr>
+        <w:t xml:space="preserve">    end</w:t>
+      </w:r>
+      <w:r>
+        <w:br/>
+      </w:r>
+      <w:r>
+        <w:br/>
+      </w:r>
+      <w:r>
+        <w:rPr>
+          <w:rStyle w:val="VerbatimChar"/>
+        </w:rPr>
+        <w:t xml:space="preserve">    subgraph Trait["Storage Trait"]</w:t>
+      </w:r>
+      <w:r>
+        <w:br/>
+      </w:r>
+      <w:r>
+        <w:rPr>
+          <w:rStyle w:val="VerbatimChar"/>
+        </w:rPr>
+        <w:t xml:space="preserve">        </w:t>
+      </w:r>
+      <w:r>
+        <w:rPr>
+          <w:rStyle w:val="VerbatimChar"/>
+          <w:rFonts w:hint="eastAsia"/>
+        </w:rPr>
+        <w:t xml:space="preserve">T[统一接口抽象]</w:t>
+      </w:r>
+      <w:r>
+        <w:br/>
+      </w:r>
+      <w:r>
+        <w:rPr>
+          <w:rStyle w:val="VerbatimChar"/>
+        </w:rPr>
+        <w:t xml:space="preserve">    end</w:t>
+      </w:r>
+      <w:r>
+        <w:br/>
+      </w:r>
+      <w:r>
+        <w:br/>
+      </w:r>
+      <w:r>
+        <w:rPr>
+          <w:rStyle w:val="VerbatimChar"/>
+        </w:rPr>
+        <w:t xml:space="preserve">    Old </w:t>
+      </w:r>
+      <w:r>
+        <w:rPr>
+          <w:rStyle w:val="VerbatimChar"/>
+          <w:rFonts w:hint="eastAsia"/>
+        </w:rPr>
+        <w:t xml:space="preserve">--&gt;|"耦合严重"|</w:t>
+      </w:r>
+      <w:r>
+        <w:rPr>
+          <w:rStyle w:val="VerbatimChar"/>
+        </w:rPr>
+        <w:t xml:space="preserve"> New</w:t>
+      </w:r>
+      <w:r>
+        <w:br/>
+      </w:r>
+      <w:r>
+        <w:rPr>
+          <w:rStyle w:val="VerbatimChar"/>
+        </w:rPr>
+        <w:t xml:space="preserve">    New </w:t>
+      </w:r>
+      <w:r>
+        <w:rPr>
+          <w:rStyle w:val="VerbatimChar"/>
+          <w:rFonts w:hint="eastAsia"/>
+        </w:rPr>
+        <w:t xml:space="preserve">-.-&gt;|"trait抽象"|</w:t>
+      </w:r>
+      <w:r>
+        <w:rPr>
+          <w:rStyle w:val="VerbatimChar"/>
+        </w:rPr>
+        <w:t xml:space="preserve"> Trait</w:t>
       </w:r>
     </w:p>
     <w:p>
@@ -6710,335 +6863,298 @@
         <w:rPr>
           <w:rStyle w:val="VerbatimChar"/>
         </w:rPr>
-        <w:t xml:space="preserve">┌─────────────────────────────────────────────────────────────────┐</w:t>
-      </w:r>
-      <w:r>
-        <w:br/>
-      </w:r>
-      <w:r>
-        <w:rPr>
-          <w:rStyle w:val="VerbatimChar"/>
-        </w:rPr>
-        <w:t xml:space="preserve">│                     </w:t>
-      </w:r>
-      <w:r>
-        <w:rPr>
-          <w:rStyle w:val="VerbatimChar"/>
-          <w:rFonts w:hint="eastAsia"/>
-        </w:rPr>
-        <w:t xml:space="preserve">用户/Agent</w:t>
-      </w:r>
-      <w:r>
-        <w:rPr>
-          <w:rStyle w:val="VerbatimChar"/>
-        </w:rPr>
-        <w:t xml:space="preserve"> (OpenClaw + LLM)                  │</w:t>
-      </w:r>
-      <w:r>
-        <w:br/>
-      </w:r>
-      <w:r>
-        <w:rPr>
-          <w:rStyle w:val="VerbatimChar"/>
-        </w:rPr>
-        <w:t xml:space="preserve">└────────────────────────────┬────────────────────────────────────┘</w:t>
-      </w:r>
-      <w:r>
-        <w:br/>
-      </w:r>
-      <w:r>
-        <w:rPr>
-          <w:rStyle w:val="VerbatimChar"/>
-        </w:rPr>
-        <w:t xml:space="preserve">                             ↓</w:t>
-      </w:r>
-      <w:r>
-        <w:br/>
-      </w:r>
-      <w:r>
-        <w:rPr>
-          <w:rStyle w:val="VerbatimChar"/>
-        </w:rPr>
-        <w:t xml:space="preserve">┌─────────────────────────────────────────────────────────────────┐</w:t>
-      </w:r>
-      <w:r>
-        <w:br/>
-      </w:r>
-      <w:r>
-        <w:rPr>
-          <w:rStyle w:val="VerbatimChar"/>
-        </w:rPr>
-        <w:t xml:space="preserve">│                   SQLRustGo API </w:t>
-      </w:r>
-      <w:r>
-        <w:rPr>
-          <w:rStyle w:val="VerbatimChar"/>
-          <w:rFonts w:hint="eastAsia"/>
-        </w:rPr>
-        <w:t xml:space="preserve">层</w:t>
-      </w:r>
-      <w:r>
-        <w:rPr>
-          <w:rStyle w:val="VerbatimChar"/>
-        </w:rPr>
-        <w:t xml:space="preserve">                               │</w:t>
-      </w:r>
-      <w:r>
-        <w:br/>
-      </w:r>
-      <w:r>
-        <w:rPr>
-          <w:rStyle w:val="VerbatimChar"/>
-        </w:rPr>
-        <w:t xml:space="preserve">│  ┌──────────┐ ┌──────────┐ ┌──────────┐ ┌──────────┐         │</w:t>
-      </w:r>
-      <w:r>
-        <w:br/>
-      </w:r>
-      <w:r>
-        <w:rPr>
-          <w:rStyle w:val="VerbatimChar"/>
-        </w:rPr>
-        <w:t xml:space="preserve">│  │ SQL API  │ │Vector API│ │Graph API │ │ RAG API  │         │</w:t>
-      </w:r>
-      <w:r>
-        <w:br/>
-      </w:r>
-      <w:r>
-        <w:rPr>
-          <w:rStyle w:val="VerbatimChar"/>
-        </w:rPr>
-        <w:t xml:space="preserve">│  └────┬─────┘ └────┬─────┘ └────┬─────┘ └────┬─────┘         │</w:t>
-      </w:r>
-      <w:r>
-        <w:br/>
-      </w:r>
-      <w:r>
-        <w:rPr>
-          <w:rStyle w:val="VerbatimChar"/>
-        </w:rPr>
-        <w:t xml:space="preserve">└───────┼────────────┼────────────┼────────────┼──────────────────┘</w:t>
-      </w:r>
-      <w:r>
-        <w:br/>
-      </w:r>
-      <w:r>
-        <w:rPr>
-          <w:rStyle w:val="VerbatimChar"/>
-        </w:rPr>
-        <w:t xml:space="preserve">        ↓            ↓            ↓            ↓</w:t>
-      </w:r>
-      <w:r>
-        <w:br/>
-      </w:r>
-      <w:r>
-        <w:rPr>
-          <w:rStyle w:val="VerbatimChar"/>
-        </w:rPr>
-        <w:t xml:space="preserve">┌─────────────────────────────────────────────────────────────────┐</w:t>
-      </w:r>
-      <w:r>
-        <w:br/>
-      </w:r>
-      <w:r>
-        <w:rPr>
-          <w:rStyle w:val="VerbatimChar"/>
-        </w:rPr>
-        <w:t xml:space="preserve">│                    SQLRustGo </w:t>
-      </w:r>
-      <w:r>
-        <w:rPr>
-          <w:rStyle w:val="VerbatimChar"/>
-          <w:rFonts w:hint="eastAsia"/>
-        </w:rPr>
-        <w:t xml:space="preserve">核心引擎</w:t>
-      </w:r>
-      <w:r>
-        <w:rPr>
-          <w:rStyle w:val="VerbatimChar"/>
-        </w:rPr>
-        <w:t xml:space="preserve">                           │</w:t>
-      </w:r>
-      <w:r>
-        <w:br/>
-      </w:r>
-      <w:r>
-        <w:rPr>
-          <w:rStyle w:val="VerbatimChar"/>
-        </w:rPr>
-        <w:t xml:space="preserve">│  ┌──────────────┐ ┌──────────────┐ ┌──────────────┐          │</w:t>
-      </w:r>
-      <w:r>
-        <w:br/>
-      </w:r>
-      <w:r>
-        <w:rPr>
-          <w:rStyle w:val="VerbatimChar"/>
-        </w:rPr>
-        <w:t xml:space="preserve">│  │   RDBMS </w:t>
-      </w:r>
-      <w:r>
-        <w:rPr>
-          <w:rStyle w:val="VerbatimChar"/>
-          <w:rFonts w:hint="eastAsia"/>
-        </w:rPr>
-        <w:t xml:space="preserve">层</w:t>
-      </w:r>
-      <w:r>
-        <w:rPr>
-          <w:rStyle w:val="VerbatimChar"/>
-        </w:rPr>
-        <w:t xml:space="preserve">   │ │ </w:t>
-      </w:r>
-      <w:r>
-        <w:rPr>
-          <w:rStyle w:val="VerbatimChar"/>
-          <w:rFonts w:hint="eastAsia"/>
-        </w:rPr>
-        <w:t xml:space="preserve">向量计算函数</w:t>
-      </w:r>
-      <w:r>
-        <w:rPr>
-          <w:rStyle w:val="VerbatimChar"/>
-        </w:rPr>
-        <w:t xml:space="preserve">  │ │  </w:t>
-      </w:r>
-      <w:r>
-        <w:rPr>
-          <w:rStyle w:val="VerbatimChar"/>
-          <w:rFonts w:hint="eastAsia"/>
-        </w:rPr>
-        <w:t xml:space="preserve">图检索引擎</w:t>
-      </w:r>
-      <w:r>
-        <w:rPr>
-          <w:rStyle w:val="VerbatimChar"/>
-        </w:rPr>
-        <w:t xml:space="preserve">   │          │</w:t>
-      </w:r>
-      <w:r>
-        <w:br/>
-      </w:r>
-      <w:r>
-        <w:rPr>
-          <w:rStyle w:val="VerbatimChar"/>
-        </w:rPr>
-        <w:t xml:space="preserve">│  │ Columnar/Row │ │ cosine/knn   │ │  BFS/DFS     │          │</w:t>
-      </w:r>
-      <w:r>
-        <w:br/>
-      </w:r>
-      <w:r>
-        <w:rPr>
-          <w:rStyle w:val="VerbatimChar"/>
-        </w:rPr>
-        <w:t xml:space="preserve">│  └──────┬───────┘ └──────┬───────┘ └──────┬───────┘          │</w:t>
-      </w:r>
-      <w:r>
-        <w:br/>
-      </w:r>
-      <w:r>
-        <w:rPr>
-          <w:rStyle w:val="VerbatimChar"/>
-        </w:rPr>
-        <w:t xml:space="preserve">│         ↓                ↓                ↓                     │</w:t>
-      </w:r>
-      <w:r>
-        <w:br/>
-      </w:r>
-      <w:r>
-        <w:rPr>
-          <w:rStyle w:val="VerbatimChar"/>
-        </w:rPr>
-        <w:t xml:space="preserve">│  ┌────────────────────────────────────────────────────────────┐ │</w:t>
-      </w:r>
-      <w:r>
-        <w:br/>
-      </w:r>
-      <w:r>
-        <w:rPr>
-          <w:rStyle w:val="VerbatimChar"/>
-        </w:rPr>
-        <w:t xml:space="preserve">│  │              </w:t>
-      </w:r>
-      <w:r>
-        <w:rPr>
-          <w:rStyle w:val="VerbatimChar"/>
-          <w:rFonts w:hint="eastAsia"/>
-        </w:rPr>
-        <w:t xml:space="preserve">存储层</w:t>
-      </w:r>
-      <w:r>
-        <w:rPr>
-          <w:rStyle w:val="VerbatimChar"/>
-        </w:rPr>
-        <w:t xml:space="preserve"> (ColumnarStorage)                       │ │</w:t>
-      </w:r>
-      <w:r>
-        <w:br/>
-      </w:r>
-      <w:r>
-        <w:rPr>
-          <w:rStyle w:val="VerbatimChar"/>
-        </w:rPr>
-        <w:t xml:space="preserve">│  │   </w:t>
-      </w:r>
-      <w:r>
-        <w:rPr>
-          <w:rStyle w:val="VerbatimChar"/>
-          <w:rFonts w:hint="eastAsia"/>
-        </w:rPr>
-        <w:t xml:space="preserve">关系表</w:t>
-      </w:r>
-      <w:r>
-        <w:rPr>
-          <w:rStyle w:val="VerbatimChar"/>
-        </w:rPr>
-        <w:t xml:space="preserve">        │      </w:t>
-      </w:r>
-      <w:r>
-        <w:rPr>
-          <w:rStyle w:val="VerbatimChar"/>
-          <w:rFonts w:hint="eastAsia"/>
-        </w:rPr>
-        <w:t xml:space="preserve">向量表</w:t>
-      </w:r>
-      <w:r>
-        <w:rPr>
-          <w:rStyle w:val="VerbatimChar"/>
-        </w:rPr>
-        <w:t xml:space="preserve">         │      </w:t>
-      </w:r>
-      <w:r>
-        <w:rPr>
-          <w:rStyle w:val="VerbatimChar"/>
-          <w:rFonts w:hint="eastAsia"/>
-        </w:rPr>
-        <w:t xml:space="preserve">知识图谱表</w:t>
-      </w:r>
-      <w:r>
-        <w:rPr>
-          <w:rStyle w:val="VerbatimChar"/>
-        </w:rPr>
-        <w:t xml:space="preserve">     │ │</w:t>
-      </w:r>
-      <w:r>
-        <w:br/>
-      </w:r>
-      <w:r>
-        <w:rPr>
-          <w:rStyle w:val="VerbatimChar"/>
-        </w:rPr>
-        <w:t xml:space="preserve">│  └────────────────────────────────────────────────────────────┘ │</w:t>
-      </w:r>
-      <w:r>
-        <w:br/>
-      </w:r>
-      <w:r>
-        <w:rPr>
-          <w:rStyle w:val="VerbatimChar"/>
-        </w:rPr>
-        <w:t xml:space="preserve">└─────────────────────────────────────────────────────────────────┘</w:t>
+        <w:t xml:space="preserve">flowchart TB</w:t>
+      </w:r>
+      <w:r>
+        <w:br/>
+      </w:r>
+      <w:r>
+        <w:rPr>
+          <w:rStyle w:val="VerbatimChar"/>
+        </w:rPr>
+        <w:t xml:space="preserve">    </w:t>
+      </w:r>
+      <w:r>
+        <w:rPr>
+          <w:rStyle w:val="VerbatimChar"/>
+          <w:rFonts w:hint="eastAsia"/>
+        </w:rPr>
+        <w:t xml:space="preserve">UA["用户/Agent</w:t>
+      </w:r>
+      <w:r>
+        <w:rPr>
+          <w:rStyle w:val="VerbatimChar"/>
+        </w:rPr>
+        <w:t xml:space="preserve"> (OpenClaw + LLM)"]</w:t>
+      </w:r>
+      <w:r>
+        <w:br/>
+      </w:r>
+      <w:r>
+        <w:rPr>
+          <w:rStyle w:val="VerbatimChar"/>
+        </w:rPr>
+        <w:t xml:space="preserve">    </w:t>
+      </w:r>
+      <w:r>
+        <w:br/>
+      </w:r>
+      <w:r>
+        <w:rPr>
+          <w:rStyle w:val="VerbatimChar"/>
+        </w:rPr>
+        <w:t xml:space="preserve">    subgraph API["SQLRustGo API Layer"]</w:t>
+      </w:r>
+      <w:r>
+        <w:br/>
+      </w:r>
+      <w:r>
+        <w:rPr>
+          <w:rStyle w:val="VerbatimChar"/>
+        </w:rPr>
+        <w:t xml:space="preserve">        SQL[SQL API]</w:t>
+      </w:r>
+      <w:r>
+        <w:br/>
+      </w:r>
+      <w:r>
+        <w:rPr>
+          <w:rStyle w:val="VerbatimChar"/>
+        </w:rPr>
+        <w:t xml:space="preserve">        VEC[Vector API]</w:t>
+      </w:r>
+      <w:r>
+        <w:br/>
+      </w:r>
+      <w:r>
+        <w:rPr>
+          <w:rStyle w:val="VerbatimChar"/>
+        </w:rPr>
+        <w:t xml:space="preserve">        GRAPH[Graph API]</w:t>
+      </w:r>
+      <w:r>
+        <w:br/>
+      </w:r>
+      <w:r>
+        <w:rPr>
+          <w:rStyle w:val="VerbatimChar"/>
+        </w:rPr>
+        <w:t xml:space="preserve">        RAG[RAG API]</w:t>
+      </w:r>
+      <w:r>
+        <w:br/>
+      </w:r>
+      <w:r>
+        <w:rPr>
+          <w:rStyle w:val="VerbatimChar"/>
+        </w:rPr>
+        <w:t xml:space="preserve">    end</w:t>
+      </w:r>
+      <w:r>
+        <w:br/>
+      </w:r>
+      <w:r>
+        <w:rPr>
+          <w:rStyle w:val="VerbatimChar"/>
+        </w:rPr>
+        <w:t xml:space="preserve">    </w:t>
+      </w:r>
+      <w:r>
+        <w:br/>
+      </w:r>
+      <w:r>
+        <w:rPr>
+          <w:rStyle w:val="VerbatimChar"/>
+        </w:rPr>
+        <w:t xml:space="preserve">    subgraph Engine["SQLRustGo </w:t>
+      </w:r>
+      <w:r>
+        <w:rPr>
+          <w:rStyle w:val="VerbatimChar"/>
+          <w:rFonts w:hint="eastAsia"/>
+        </w:rPr>
+        <w:t xml:space="preserve">核心引擎"]</w:t>
+      </w:r>
+      <w:r>
+        <w:br/>
+      </w:r>
+      <w:r>
+        <w:rPr>
+          <w:rStyle w:val="VerbatimChar"/>
+        </w:rPr>
+        <w:t xml:space="preserve">        RDBMS[RDBMS </w:t>
+      </w:r>
+      <w:r>
+        <w:rPr>
+          <w:rStyle w:val="VerbatimChar"/>
+          <w:rFonts w:hint="eastAsia"/>
+        </w:rPr>
+        <w:t xml:space="preserve">层&lt;br/&gt;Columnar/Row]</w:t>
+      </w:r>
+      <w:r>
+        <w:br/>
+      </w:r>
+      <w:r>
+        <w:rPr>
+          <w:rStyle w:val="VerbatimChar"/>
+        </w:rPr>
+        <w:t xml:space="preserve">        </w:t>
+      </w:r>
+      <w:r>
+        <w:rPr>
+          <w:rStyle w:val="VerbatimChar"/>
+          <w:rFonts w:hint="eastAsia"/>
+        </w:rPr>
+        <w:t xml:space="preserve">VF[向量计算函数&lt;br/&gt;cosine/knn]</w:t>
+      </w:r>
+      <w:r>
+        <w:br/>
+      </w:r>
+      <w:r>
+        <w:rPr>
+          <w:rStyle w:val="VerbatimChar"/>
+        </w:rPr>
+        <w:t xml:space="preserve">        </w:t>
+      </w:r>
+      <w:r>
+        <w:rPr>
+          <w:rStyle w:val="VerbatimChar"/>
+          <w:rFonts w:hint="eastAsia"/>
+        </w:rPr>
+        <w:t xml:space="preserve">GE[图检索引擎&lt;br/&gt;BFS/DFS]</w:t>
+      </w:r>
+      <w:r>
+        <w:br/>
+      </w:r>
+      <w:r>
+        <w:rPr>
+          <w:rStyle w:val="VerbatimChar"/>
+        </w:rPr>
+        <w:t xml:space="preserve">    end</w:t>
+      </w:r>
+      <w:r>
+        <w:br/>
+      </w:r>
+      <w:r>
+        <w:rPr>
+          <w:rStyle w:val="VerbatimChar"/>
+        </w:rPr>
+        <w:t xml:space="preserve">    </w:t>
+      </w:r>
+      <w:r>
+        <w:br/>
+      </w:r>
+      <w:r>
+        <w:rPr>
+          <w:rStyle w:val="VerbatimChar"/>
+        </w:rPr>
+        <w:t xml:space="preserve">    subgraph </w:t>
+      </w:r>
+      <w:r>
+        <w:rPr>
+          <w:rStyle w:val="VerbatimChar"/>
+          <w:rFonts w:hint="eastAsia"/>
+        </w:rPr>
+        <w:t xml:space="preserve">Storage["存储层</w:t>
+      </w:r>
+      <w:r>
+        <w:rPr>
+          <w:rStyle w:val="VerbatimChar"/>
+        </w:rPr>
+        <w:t xml:space="preserve"> (ColumnarStorage)"]</w:t>
+      </w:r>
+      <w:r>
+        <w:br/>
+      </w:r>
+      <w:r>
+        <w:rPr>
+          <w:rStyle w:val="VerbatimChar"/>
+        </w:rPr>
+        <w:t xml:space="preserve">        </w:t>
+      </w:r>
+      <w:r>
+        <w:rPr>
+          <w:rStyle w:val="VerbatimChar"/>
+          <w:rFonts w:hint="eastAsia"/>
+        </w:rPr>
+        <w:t xml:space="preserve">RT[关系表]</w:t>
+      </w:r>
+      <w:r>
+        <w:br/>
+      </w:r>
+      <w:r>
+        <w:rPr>
+          <w:rStyle w:val="VerbatimChar"/>
+        </w:rPr>
+        <w:t xml:space="preserve">        </w:t>
+      </w:r>
+      <w:r>
+        <w:rPr>
+          <w:rStyle w:val="VerbatimChar"/>
+          <w:rFonts w:hint="eastAsia"/>
+        </w:rPr>
+        <w:t xml:space="preserve">VT[向量表]</w:t>
+      </w:r>
+      <w:r>
+        <w:br/>
+      </w:r>
+      <w:r>
+        <w:rPr>
+          <w:rStyle w:val="VerbatimChar"/>
+        </w:rPr>
+        <w:t xml:space="preserve">        </w:t>
+      </w:r>
+      <w:r>
+        <w:rPr>
+          <w:rStyle w:val="VerbatimChar"/>
+          <w:rFonts w:hint="eastAsia"/>
+        </w:rPr>
+        <w:t xml:space="preserve">KGT[知识图谱表]</w:t>
+      </w:r>
+      <w:r>
+        <w:br/>
+      </w:r>
+      <w:r>
+        <w:rPr>
+          <w:rStyle w:val="VerbatimChar"/>
+        </w:rPr>
+        <w:t xml:space="preserve">    end</w:t>
+      </w:r>
+      <w:r>
+        <w:br/>
+      </w:r>
+      <w:r>
+        <w:rPr>
+          <w:rStyle w:val="VerbatimChar"/>
+        </w:rPr>
+        <w:t xml:space="preserve">    </w:t>
+      </w:r>
+      <w:r>
+        <w:br/>
+      </w:r>
+      <w:r>
+        <w:rPr>
+          <w:rStyle w:val="VerbatimChar"/>
+        </w:rPr>
+        <w:t xml:space="preserve">    UA --&gt; API</w:t>
+      </w:r>
+      <w:r>
+        <w:br/>
+      </w:r>
+      <w:r>
+        <w:rPr>
+          <w:rStyle w:val="VerbatimChar"/>
+        </w:rPr>
+        <w:t xml:space="preserve">    API --&gt; Engine</w:t>
+      </w:r>
+      <w:r>
+        <w:br/>
+      </w:r>
+      <w:r>
+        <w:rPr>
+          <w:rStyle w:val="VerbatimChar"/>
+        </w:rPr>
+        <w:t xml:space="preserve">    Engine --&gt; Storage</w:t>
       </w:r>
     </w:p>
     <w:bookmarkEnd w:id="52"/>
@@ -8572,148 +8688,192 @@
         <w:rPr>
           <w:rStyle w:val="VerbatimChar"/>
         </w:rPr>
-        <w:t xml:space="preserve">┌─────────────┐    ┌─────────────┐    ┌─────────────┐    ┌─────────────┐</w:t>
-      </w:r>
-      <w:r>
-        <w:br/>
-      </w:r>
-      <w:r>
-        <w:rPr>
-          <w:rStyle w:val="VerbatimChar"/>
-        </w:rPr>
-        <w:t xml:space="preserve">│    </w:t>
-      </w:r>
-      <w:r>
-        <w:rPr>
-          <w:rStyle w:val="VerbatimChar"/>
-          <w:rFonts w:hint="eastAsia"/>
-        </w:rPr>
-        <w:t xml:space="preserve">用户问题</w:t>
-      </w:r>
-      <w:r>
-        <w:rPr>
-          <w:rStyle w:val="VerbatimChar"/>
-        </w:rPr>
-        <w:t xml:space="preserve">   │ -&gt; │   </w:t>
-      </w:r>
-      <w:r>
-        <w:rPr>
-          <w:rStyle w:val="VerbatimChar"/>
-          <w:rFonts w:hint="eastAsia"/>
-        </w:rPr>
-        <w:t xml:space="preserve">检索模块</w:t>
-      </w:r>
-      <w:r>
-        <w:rPr>
-          <w:rStyle w:val="VerbatimChar"/>
-        </w:rPr>
-        <w:t xml:space="preserve">   │ -&gt; │   </w:t>
-      </w:r>
-      <w:r>
-        <w:rPr>
-          <w:rStyle w:val="VerbatimChar"/>
-          <w:rFonts w:hint="eastAsia"/>
-        </w:rPr>
-        <w:t xml:space="preserve">生成模块</w:t>
-      </w:r>
-      <w:r>
-        <w:rPr>
-          <w:rStyle w:val="VerbatimChar"/>
-        </w:rPr>
-        <w:t xml:space="preserve">   │ -&gt; │    </w:t>
-      </w:r>
-      <w:r>
-        <w:rPr>
-          <w:rStyle w:val="VerbatimChar"/>
-          <w:rFonts w:hint="eastAsia"/>
-        </w:rPr>
-        <w:t xml:space="preserve">回答</w:t>
-      </w:r>
-      <w:r>
-        <w:rPr>
-          <w:rStyle w:val="VerbatimChar"/>
-        </w:rPr>
-        <w:t xml:space="preserve">     │</w:t>
-      </w:r>
-      <w:r>
-        <w:br/>
-      </w:r>
-      <w:r>
-        <w:rPr>
-          <w:rStyle w:val="VerbatimChar"/>
-        </w:rPr>
-        <w:t xml:space="preserve">└─────────────┘    └─────────────┘    └─────────────┘    └─────────────┘</w:t>
-      </w:r>
-      <w:r>
-        <w:br/>
-      </w:r>
-      <w:r>
-        <w:rPr>
-          <w:rStyle w:val="VerbatimChar"/>
-        </w:rPr>
-        <w:t xml:space="preserve">                         ↓                                   ↓</w:t>
-      </w:r>
-      <w:r>
-        <w:br/>
-      </w:r>
-      <w:r>
-        <w:rPr>
-          <w:rStyle w:val="VerbatimChar"/>
-        </w:rPr>
-        <w:t xml:space="preserve">                  ┌─────────────┐                    ┌─────────────┐</w:t>
-      </w:r>
-      <w:r>
-        <w:br/>
-      </w:r>
-      <w:r>
-        <w:rPr>
-          <w:rStyle w:val="VerbatimChar"/>
-        </w:rPr>
-        <w:t xml:space="preserve">                  │ SQL + </w:t>
-      </w:r>
-      <w:r>
-        <w:rPr>
-          <w:rStyle w:val="VerbatimChar"/>
-          <w:rFonts w:hint="eastAsia"/>
-        </w:rPr>
-        <w:t xml:space="preserve">向量</w:t>
-      </w:r>
-      <w:r>
-        <w:rPr>
-          <w:rStyle w:val="VerbatimChar"/>
-        </w:rPr>
-        <w:t xml:space="preserve">   │                    │  LLM (llama.cpp) │</w:t>
-      </w:r>
-      <w:r>
-        <w:br/>
-      </w:r>
-      <w:r>
-        <w:rPr>
-          <w:rStyle w:val="VerbatimChar"/>
-        </w:rPr>
-        <w:t xml:space="preserve">                  │  </w:t>
-      </w:r>
-      <w:r>
-        <w:rPr>
-          <w:rStyle w:val="VerbatimChar"/>
-          <w:rFonts w:hint="eastAsia"/>
-        </w:rPr>
-        <w:t xml:space="preserve">双重检索</w:t>
-      </w:r>
-      <w:r>
-        <w:rPr>
-          <w:rStyle w:val="VerbatimChar"/>
-        </w:rPr>
-        <w:t xml:space="preserve">    │                    │              │</w:t>
-      </w:r>
-      <w:r>
-        <w:br/>
-      </w:r>
-      <w:r>
-        <w:rPr>
-          <w:rStyle w:val="VerbatimChar"/>
-        </w:rPr>
-        <w:t xml:space="preserve">                  └─────────────┘                    └─────────────┘</w:t>
+        <w:t xml:space="preserve">flowchart LR</w:t>
+      </w:r>
+      <w:r>
+        <w:br/>
+      </w:r>
+      <w:r>
+        <w:rPr>
+          <w:rStyle w:val="VerbatimChar"/>
+        </w:rPr>
+        <w:t xml:space="preserve">    </w:t>
+      </w:r>
+      <w:r>
+        <w:rPr>
+          <w:rStyle w:val="VerbatimChar"/>
+          <w:rFonts w:hint="eastAsia"/>
+        </w:rPr>
+        <w:t xml:space="preserve">Q[用户问题]</w:t>
+      </w:r>
+      <w:r>
+        <w:rPr>
+          <w:rStyle w:val="VerbatimChar"/>
+        </w:rPr>
+        <w:t xml:space="preserve"> --&gt; </w:t>
+      </w:r>
+      <w:r>
+        <w:rPr>
+          <w:rStyle w:val="VerbatimChar"/>
+          <w:rFonts w:hint="eastAsia"/>
+        </w:rPr>
+        <w:t xml:space="preserve">R[检索模块]</w:t>
+      </w:r>
+      <w:r>
+        <w:br/>
+      </w:r>
+      <w:r>
+        <w:rPr>
+          <w:rStyle w:val="VerbatimChar"/>
+        </w:rPr>
+        <w:t xml:space="preserve">    R --&gt; </w:t>
+      </w:r>
+      <w:r>
+        <w:rPr>
+          <w:rStyle w:val="VerbatimChar"/>
+          <w:rFonts w:hint="eastAsia"/>
+        </w:rPr>
+        <w:t xml:space="preserve">G[生成模块]</w:t>
+      </w:r>
+      <w:r>
+        <w:br/>
+      </w:r>
+      <w:r>
+        <w:rPr>
+          <w:rStyle w:val="VerbatimChar"/>
+        </w:rPr>
+        <w:t xml:space="preserve">    G --&gt; </w:t>
+      </w:r>
+      <w:r>
+        <w:rPr>
+          <w:rStyle w:val="VerbatimChar"/>
+          <w:rFonts w:hint="eastAsia"/>
+        </w:rPr>
+        <w:t xml:space="preserve">A[回答]</w:t>
+      </w:r>
+      <w:r>
+        <w:br/>
+      </w:r>
+      <w:r>
+        <w:br/>
+      </w:r>
+      <w:r>
+        <w:rPr>
+          <w:rStyle w:val="VerbatimChar"/>
+        </w:rPr>
+        <w:t xml:space="preserve">    subgraph </w:t>
+      </w:r>
+      <w:r>
+        <w:rPr>
+          <w:rStyle w:val="VerbatimChar"/>
+          <w:rFonts w:hint="eastAsia"/>
+        </w:rPr>
+        <w:t xml:space="preserve">检索["检索模块"]</w:t>
+      </w:r>
+      <w:r>
+        <w:br/>
+      </w:r>
+      <w:r>
+        <w:rPr>
+          <w:rStyle w:val="VerbatimChar"/>
+        </w:rPr>
+        <w:t xml:space="preserve">        </w:t>
+      </w:r>
+      <w:r>
+        <w:rPr>
+          <w:rStyle w:val="VerbatimChar"/>
+          <w:rFonts w:hint="eastAsia"/>
+        </w:rPr>
+        <w:t xml:space="preserve">SQL[(SQL过滤)]</w:t>
+      </w:r>
+      <w:r>
+        <w:br/>
+      </w:r>
+      <w:r>
+        <w:rPr>
+          <w:rStyle w:val="VerbatimChar"/>
+        </w:rPr>
+        <w:t xml:space="preserve">        </w:t>
+      </w:r>
+      <w:r>
+        <w:rPr>
+          <w:rStyle w:val="VerbatimChar"/>
+          <w:rFonts w:hint="eastAsia"/>
+        </w:rPr>
+        <w:t xml:space="preserve">VEC[(向量检索)]</w:t>
+      </w:r>
+      <w:r>
+        <w:br/>
+      </w:r>
+      <w:r>
+        <w:rPr>
+          <w:rStyle w:val="VerbatimChar"/>
+        </w:rPr>
+        <w:t xml:space="preserve">        R --&gt; SQL</w:t>
+      </w:r>
+      <w:r>
+        <w:br/>
+      </w:r>
+      <w:r>
+        <w:rPr>
+          <w:rStyle w:val="VerbatimChar"/>
+        </w:rPr>
+        <w:t xml:space="preserve">        R --&gt; VEC</w:t>
+      </w:r>
+      <w:r>
+        <w:br/>
+      </w:r>
+      <w:r>
+        <w:rPr>
+          <w:rStyle w:val="VerbatimChar"/>
+        </w:rPr>
+        <w:t xml:space="preserve">    end</w:t>
+      </w:r>
+      <w:r>
+        <w:br/>
+      </w:r>
+      <w:r>
+        <w:br/>
+      </w:r>
+      <w:r>
+        <w:rPr>
+          <w:rStyle w:val="VerbatimChar"/>
+        </w:rPr>
+        <w:t xml:space="preserve">    subgraph </w:t>
+      </w:r>
+      <w:r>
+        <w:rPr>
+          <w:rStyle w:val="VerbatimChar"/>
+          <w:rFonts w:hint="eastAsia"/>
+        </w:rPr>
+        <w:t xml:space="preserve">生成["生成模块"]</w:t>
+      </w:r>
+      <w:r>
+        <w:br/>
+      </w:r>
+      <w:r>
+        <w:rPr>
+          <w:rStyle w:val="VerbatimChar"/>
+        </w:rPr>
+        <w:t xml:space="preserve">        LLM[(LLM&lt;br/&gt;llama.cpp)]</w:t>
+      </w:r>
+      <w:r>
+        <w:br/>
+      </w:r>
+      <w:r>
+        <w:rPr>
+          <w:rStyle w:val="VerbatimChar"/>
+        </w:rPr>
+        <w:t xml:space="preserve">        G --&gt; LLM</w:t>
+      </w:r>
+      <w:r>
+        <w:br/>
+      </w:r>
+      <w:r>
+        <w:rPr>
+          <w:rStyle w:val="VerbatimChar"/>
+        </w:rPr>
+        <w:t xml:space="preserve">    end</w:t>
       </w:r>
     </w:p>
     <w:p>
@@ -11266,325 +11426,182 @@
         <w:rPr>
           <w:rStyle w:val="VerbatimChar"/>
         </w:rPr>
-        <w:t xml:space="preserve">┌────────────────────────────────────────────────────────────┐</w:t>
-      </w:r>
-      <w:r>
-        <w:br/>
-      </w:r>
-      <w:r>
-        <w:rPr>
-          <w:rStyle w:val="VerbatimChar"/>
-        </w:rPr>
-        <w:t xml:space="preserve">│              SQLRustGo 2.x </w:t>
-      </w:r>
-      <w:r>
-        <w:rPr>
-          <w:rStyle w:val="VerbatimChar"/>
-          <w:rFonts w:hint="eastAsia"/>
-        </w:rPr>
-        <w:t xml:space="preserve">统一数据平台</w:t>
-      </w:r>
-      <w:r>
-        <w:rPr>
-          <w:rStyle w:val="VerbatimChar"/>
-        </w:rPr>
-        <w:t xml:space="preserve">                      │</w:t>
-      </w:r>
-      <w:r>
-        <w:br/>
-      </w:r>
-      <w:r>
-        <w:rPr>
-          <w:rStyle w:val="VerbatimChar"/>
-        </w:rPr>
-        <w:t xml:space="preserve">├────────────────────────────────────────────────────────────┤</w:t>
-      </w:r>
-      <w:r>
-        <w:br/>
-      </w:r>
-      <w:r>
-        <w:rPr>
-          <w:rStyle w:val="VerbatimChar"/>
-        </w:rPr>
-        <w:t xml:space="preserve">│                                                            │</w:t>
-      </w:r>
-      <w:r>
-        <w:br/>
-      </w:r>
-      <w:r>
-        <w:rPr>
-          <w:rStyle w:val="VerbatimChar"/>
-        </w:rPr>
-        <w:t xml:space="preserve">│   ┌──────────┐   ┌──────────┐   ┌──────────┐   ┌───────┐ │</w:t>
-      </w:r>
-      <w:r>
-        <w:br/>
-      </w:r>
-      <w:r>
-        <w:rPr>
-          <w:rStyle w:val="VerbatimChar"/>
-        </w:rPr>
-        <w:t xml:space="preserve">│   │  </w:t>
-      </w:r>
-      <w:r>
-        <w:rPr>
-          <w:rStyle w:val="VerbatimChar"/>
-          <w:rFonts w:hint="eastAsia"/>
-        </w:rPr>
-        <w:t xml:space="preserve">关系数据</w:t>
-      </w:r>
-      <w:r>
-        <w:rPr>
-          <w:rStyle w:val="VerbatimChar"/>
-        </w:rPr>
-        <w:t xml:space="preserve">  │ + │  </w:t>
-      </w:r>
-      <w:r>
-        <w:rPr>
-          <w:rStyle w:val="VerbatimChar"/>
-          <w:rFonts w:hint="eastAsia"/>
-        </w:rPr>
-        <w:t xml:space="preserve">向量数据</w:t>
-      </w:r>
-      <w:r>
-        <w:rPr>
-          <w:rStyle w:val="VerbatimChar"/>
-        </w:rPr>
-        <w:t xml:space="preserve">  │ + │  </w:t>
-      </w:r>
-      <w:r>
-        <w:rPr>
-          <w:rStyle w:val="VerbatimChar"/>
-          <w:rFonts w:hint="eastAsia"/>
-        </w:rPr>
-        <w:t xml:space="preserve">图数据</w:t>
-      </w:r>
-      <w:r>
-        <w:rPr>
-          <w:rStyle w:val="VerbatimChar"/>
-        </w:rPr>
-        <w:t xml:space="preserve">   │ + │ </w:t>
-      </w:r>
-      <w:r>
-        <w:rPr>
-          <w:rStyle w:val="VerbatimChar"/>
-          <w:rFonts w:hint="eastAsia"/>
-        </w:rPr>
-        <w:t xml:space="preserve">文档</w:t>
-      </w:r>
-      <w:r>
-        <w:rPr>
-          <w:rStyle w:val="VerbatimChar"/>
-        </w:rPr>
-        <w:t xml:space="preserve">  │ │</w:t>
-      </w:r>
-      <w:r>
-        <w:br/>
-      </w:r>
-      <w:r>
-        <w:rPr>
-          <w:rStyle w:val="VerbatimChar"/>
-        </w:rPr>
-        <w:t xml:space="preserve">│   │ </w:t>
-      </w:r>
-      <w:r>
-        <w:rPr>
-          <w:rStyle w:val="VerbatimChar"/>
-          <w:rFonts w:hint="eastAsia"/>
-        </w:rPr>
-        <w:t xml:space="preserve">(结构化)</w:t>
-      </w:r>
-      <w:r>
-        <w:rPr>
-          <w:rStyle w:val="VerbatimChar"/>
-        </w:rPr>
-        <w:t xml:space="preserve">  │   │ </w:t>
-      </w:r>
-      <w:r>
-        <w:rPr>
-          <w:rStyle w:val="VerbatimChar"/>
-          <w:rFonts w:hint="eastAsia"/>
-        </w:rPr>
-        <w:t xml:space="preserve">(语义)</w:t>
-      </w:r>
-      <w:r>
-        <w:rPr>
-          <w:rStyle w:val="VerbatimChar"/>
-        </w:rPr>
-        <w:t xml:space="preserve">   │   │ </w:t>
-      </w:r>
-      <w:r>
-        <w:rPr>
-          <w:rStyle w:val="VerbatimChar"/>
-          <w:rFonts w:hint="eastAsia"/>
-        </w:rPr>
-        <w:t xml:space="preserve">(关系)</w:t>
-      </w:r>
-      <w:r>
-        <w:rPr>
-          <w:rStyle w:val="VerbatimChar"/>
-        </w:rPr>
-        <w:t xml:space="preserve">   │   </w:t>
-      </w:r>
-      <w:r>
-        <w:rPr>
-          <w:rStyle w:val="VerbatimChar"/>
-          <w:rFonts w:hint="eastAsia"/>
-        </w:rPr>
-        <w:t xml:space="preserve">│(全文)</w:t>
-      </w:r>
-      <w:r>
-        <w:rPr>
-          <w:rStyle w:val="VerbatimChar"/>
-        </w:rPr>
-        <w:t xml:space="preserve"> │ │</w:t>
-      </w:r>
-      <w:r>
-        <w:br/>
-      </w:r>
-      <w:r>
-        <w:rPr>
-          <w:rStyle w:val="VerbatimChar"/>
-        </w:rPr>
-        <w:t xml:space="preserve">│   └──────────┘   └──────────┘   └──────────┘   └───────┘ │</w:t>
-      </w:r>
-      <w:r>
-        <w:br/>
-      </w:r>
-      <w:r>
-        <w:rPr>
-          <w:rStyle w:val="VerbatimChar"/>
-        </w:rPr>
-        <w:t xml:space="preserve">│         ↓              ↓              ↓              ↓      │</w:t>
-      </w:r>
-      <w:r>
-        <w:br/>
-      </w:r>
-      <w:r>
-        <w:rPr>
-          <w:rStyle w:val="VerbatimChar"/>
-        </w:rPr>
-        <w:t xml:space="preserve">│   ┌─────────────────────────────────────────────────────┐  │</w:t>
-      </w:r>
-      <w:r>
-        <w:br/>
-      </w:r>
-      <w:r>
-        <w:rPr>
-          <w:rStyle w:val="VerbatimChar"/>
-        </w:rPr>
-        <w:t xml:space="preserve">│   │              </w:t>
-      </w:r>
-      <w:r>
-        <w:rPr>
-          <w:rStyle w:val="VerbatimChar"/>
-          <w:rFonts w:hint="eastAsia"/>
-        </w:rPr>
-        <w:t xml:space="preserve">统一查询引擎</w:t>
-      </w:r>
-      <w:r>
-        <w:rPr>
-          <w:rStyle w:val="VerbatimChar"/>
-        </w:rPr>
-        <w:t xml:space="preserve">                            │  │</w:t>
-      </w:r>
-      <w:r>
-        <w:br/>
-      </w:r>
-      <w:r>
-        <w:rPr>
-          <w:rStyle w:val="VerbatimChar"/>
-        </w:rPr>
-        <w:t xml:space="preserve">│   │     SQL + Vector + Graph + FTS </w:t>
-      </w:r>
-      <w:r>
-        <w:rPr>
-          <w:rStyle w:val="VerbatimChar"/>
-          <w:rFonts w:hint="eastAsia"/>
-        </w:rPr>
-        <w:t xml:space="preserve">联合查询</w:t>
-      </w:r>
-      <w:r>
-        <w:rPr>
-          <w:rStyle w:val="VerbatimChar"/>
-        </w:rPr>
-        <w:t xml:space="preserve">             │  │</w:t>
-      </w:r>
-      <w:r>
-        <w:br/>
-      </w:r>
-      <w:r>
-        <w:rPr>
-          <w:rStyle w:val="VerbatimChar"/>
-        </w:rPr>
-        <w:t xml:space="preserve">│   └─────────────────────────────────────────────────────┘  │</w:t>
-      </w:r>
-      <w:r>
-        <w:br/>
-      </w:r>
-      <w:r>
-        <w:rPr>
-          <w:rStyle w:val="VerbatimChar"/>
-        </w:rPr>
-        <w:t xml:space="preserve">│                           ↓                                 │</w:t>
-      </w:r>
-      <w:r>
-        <w:br/>
-      </w:r>
-      <w:r>
-        <w:rPr>
-          <w:rStyle w:val="VerbatimChar"/>
-        </w:rPr>
-        <w:t xml:space="preserve">│   ┌─────────────────────────────────────────────────────┐  │</w:t>
-      </w:r>
-      <w:r>
-        <w:br/>
-      </w:r>
-      <w:r>
-        <w:rPr>
-          <w:rStyle w:val="VerbatimChar"/>
-        </w:rPr>
-        <w:t xml:space="preserve">│   │           </w:t>
-      </w:r>
-      <w:r>
-        <w:rPr>
-          <w:rStyle w:val="VerbatimChar"/>
-          <w:rFonts w:hint="eastAsia"/>
-        </w:rPr>
-        <w:t xml:space="preserve">统一存储层</w:t>
-      </w:r>
-      <w:r>
-        <w:rPr>
-          <w:rStyle w:val="VerbatimChar"/>
-        </w:rPr>
-        <w:t xml:space="preserve"> (ColumnarStorage)               │  │</w:t>
-      </w:r>
-      <w:r>
-        <w:br/>
-      </w:r>
-      <w:r>
-        <w:rPr>
-          <w:rStyle w:val="VerbatimChar"/>
-        </w:rPr>
-        <w:t xml:space="preserve">│   └─────────────────────────────────────────────────────┘  │</w:t>
-      </w:r>
-      <w:r>
-        <w:br/>
-      </w:r>
-      <w:r>
-        <w:rPr>
-          <w:rStyle w:val="VerbatimChar"/>
-        </w:rPr>
-        <w:t xml:space="preserve">│                                                            │</w:t>
-      </w:r>
-      <w:r>
-        <w:br/>
-      </w:r>
-      <w:r>
-        <w:rPr>
-          <w:rStyle w:val="VerbatimChar"/>
-        </w:rPr>
-        <w:t xml:space="preserve">└────────────────────────────────────────────────────────────┘</w:t>
+        <w:t xml:space="preserve">flowchart TB</w:t>
+      </w:r>
+      <w:r>
+        <w:br/>
+      </w:r>
+      <w:r>
+        <w:rPr>
+          <w:rStyle w:val="VerbatimChar"/>
+        </w:rPr>
+        <w:t xml:space="preserve">    subgraph </w:t>
+      </w:r>
+      <w:r>
+        <w:rPr>
+          <w:rStyle w:val="VerbatimChar"/>
+          <w:rFonts w:hint="eastAsia"/>
+        </w:rPr>
+        <w:t xml:space="preserve">Data["多模态数据"]</w:t>
+      </w:r>
+      <w:r>
+        <w:br/>
+      </w:r>
+      <w:r>
+        <w:rPr>
+          <w:rStyle w:val="VerbatimChar"/>
+        </w:rPr>
+        <w:t xml:space="preserve">        </w:t>
+      </w:r>
+      <w:r>
+        <w:rPr>
+          <w:rStyle w:val="VerbatimChar"/>
+          <w:rFonts w:hint="eastAsia"/>
+        </w:rPr>
+        <w:t xml:space="preserve">RDB[关系数据&lt;br/&gt;结构化]</w:t>
+      </w:r>
+      <w:r>
+        <w:br/>
+      </w:r>
+      <w:r>
+        <w:rPr>
+          <w:rStyle w:val="VerbatimChar"/>
+        </w:rPr>
+        <w:t xml:space="preserve">        </w:t>
+      </w:r>
+      <w:r>
+        <w:rPr>
+          <w:rStyle w:val="VerbatimChar"/>
+          <w:rFonts w:hint="eastAsia"/>
+        </w:rPr>
+        <w:t xml:space="preserve">VEC[向量数据&lt;br/&gt;语义]</w:t>
+      </w:r>
+      <w:r>
+        <w:br/>
+      </w:r>
+      <w:r>
+        <w:rPr>
+          <w:rStyle w:val="VerbatimChar"/>
+        </w:rPr>
+        <w:t xml:space="preserve">        </w:t>
+      </w:r>
+      <w:r>
+        <w:rPr>
+          <w:rStyle w:val="VerbatimChar"/>
+          <w:rFonts w:hint="eastAsia"/>
+        </w:rPr>
+        <w:t xml:space="preserve">GRAPH[图数据&lt;br/&gt;关系]</w:t>
+      </w:r>
+      <w:r>
+        <w:br/>
+      </w:r>
+      <w:r>
+        <w:rPr>
+          <w:rStyle w:val="VerbatimChar"/>
+        </w:rPr>
+        <w:t xml:space="preserve">        </w:t>
+      </w:r>
+      <w:r>
+        <w:rPr>
+          <w:rStyle w:val="VerbatimChar"/>
+          <w:rFonts w:hint="eastAsia"/>
+        </w:rPr>
+        <w:t xml:space="preserve">DOC[文档&lt;br/&gt;全文]</w:t>
+      </w:r>
+      <w:r>
+        <w:br/>
+      </w:r>
+      <w:r>
+        <w:rPr>
+          <w:rStyle w:val="VerbatimChar"/>
+        </w:rPr>
+        <w:t xml:space="preserve">    end</w:t>
+      </w:r>
+      <w:r>
+        <w:br/>
+      </w:r>
+      <w:r>
+        <w:br/>
+      </w:r>
+      <w:r>
+        <w:rPr>
+          <w:rStyle w:val="VerbatimChar"/>
+        </w:rPr>
+        <w:t xml:space="preserve">    subgraph </w:t>
+      </w:r>
+      <w:r>
+        <w:rPr>
+          <w:rStyle w:val="VerbatimChar"/>
+          <w:rFonts w:hint="eastAsia"/>
+        </w:rPr>
+        <w:t xml:space="preserve">Engine["统一查询引擎"]</w:t>
+      </w:r>
+      <w:r>
+        <w:br/>
+      </w:r>
+      <w:r>
+        <w:rPr>
+          <w:rStyle w:val="VerbatimChar"/>
+        </w:rPr>
+        <w:t xml:space="preserve">        Q[SQL + Vector&lt;br/&gt;+ Graph + FTS]</w:t>
+      </w:r>
+      <w:r>
+        <w:br/>
+      </w:r>
+      <w:r>
+        <w:rPr>
+          <w:rStyle w:val="VerbatimChar"/>
+        </w:rPr>
+        <w:t xml:space="preserve">    end</w:t>
+      </w:r>
+      <w:r>
+        <w:br/>
+      </w:r>
+      <w:r>
+        <w:br/>
+      </w:r>
+      <w:r>
+        <w:rPr>
+          <w:rStyle w:val="VerbatimChar"/>
+        </w:rPr>
+        <w:t xml:space="preserve">    subgraph </w:t>
+      </w:r>
+      <w:r>
+        <w:rPr>
+          <w:rStyle w:val="VerbatimChar"/>
+          <w:rFonts w:hint="eastAsia"/>
+        </w:rPr>
+        <w:t xml:space="preserve">Storage["统一存储层"]</w:t>
+      </w:r>
+      <w:r>
+        <w:br/>
+      </w:r>
+      <w:r>
+        <w:rPr>
+          <w:rStyle w:val="VerbatimChar"/>
+        </w:rPr>
+        <w:t xml:space="preserve">        CS[(ColumnarStorage)]</w:t>
+      </w:r>
+      <w:r>
+        <w:br/>
+      </w:r>
+      <w:r>
+        <w:rPr>
+          <w:rStyle w:val="VerbatimChar"/>
+        </w:rPr>
+        <w:t xml:space="preserve">    end</w:t>
+      </w:r>
+      <w:r>
+        <w:br/>
+      </w:r>
+      <w:r>
+        <w:br/>
+      </w:r>
+      <w:r>
+        <w:rPr>
+          <w:rStyle w:val="VerbatimChar"/>
+        </w:rPr>
+        <w:t xml:space="preserve">    Data --&gt; Q --&gt; Storage</w:t>
       </w:r>
     </w:p>
     <w:tbl>
@@ -11901,257 +11918,235 @@
         <w:rPr>
           <w:rStyle w:val="VerbatimChar"/>
         </w:rPr>
-        <w:t xml:space="preserve">┌─────────────────────────────────────────────────────────┐</w:t>
-      </w:r>
-      <w:r>
-        <w:br/>
-      </w:r>
-      <w:r>
-        <w:rPr>
-          <w:rStyle w:val="VerbatimChar"/>
-        </w:rPr>
-        <w:t xml:space="preserve">│                    Parser Layer                          │</w:t>
-      </w:r>
-      <w:r>
-        <w:br/>
-      </w:r>
-      <w:r>
-        <w:rPr>
-          <w:rStyle w:val="VerbatimChar"/>
-        </w:rPr>
-        <w:t xml:space="preserve">│         Lexer → Parser → AST                             │</w:t>
-      </w:r>
-      <w:r>
-        <w:br/>
-      </w:r>
-      <w:r>
-        <w:rPr>
-          <w:rStyle w:val="VerbatimChar"/>
-        </w:rPr>
-        <w:t xml:space="preserve">│         </w:t>
-      </w:r>
-      <w:r>
-        <w:rPr>
-          <w:rStyle w:val="VerbatimChar"/>
-          <w:rFonts w:hint="eastAsia"/>
-        </w:rPr>
-        <w:t xml:space="preserve">功能：SQL解析、语法检查</w:t>
-      </w:r>
-      <w:r>
-        <w:rPr>
-          <w:rStyle w:val="VerbatimChar"/>
-        </w:rPr>
-        <w:t xml:space="preserve">                           │</w:t>
-      </w:r>
-      <w:r>
-        <w:br/>
-      </w:r>
-      <w:r>
-        <w:rPr>
-          <w:rStyle w:val="VerbatimChar"/>
-        </w:rPr>
-        <w:t xml:space="preserve">└─────────────────────────────────────────────────────────┘</w:t>
-      </w:r>
-      <w:r>
-        <w:br/>
-      </w:r>
-      <w:r>
-        <w:rPr>
-          <w:rStyle w:val="VerbatimChar"/>
-        </w:rPr>
-        <w:t xml:space="preserve">                          ↓</w:t>
-      </w:r>
-      <w:r>
-        <w:br/>
-      </w:r>
-      <w:r>
-        <w:rPr>
-          <w:rStyle w:val="VerbatimChar"/>
-        </w:rPr>
-        <w:t xml:space="preserve">┌─────────────────────────────────────────────────────────┐</w:t>
-      </w:r>
-      <w:r>
-        <w:br/>
-      </w:r>
-      <w:r>
-        <w:rPr>
-          <w:rStyle w:val="VerbatimChar"/>
-        </w:rPr>
-        <w:t xml:space="preserve">│                    Planner Layer                         │</w:t>
-      </w:r>
-      <w:r>
-        <w:br/>
-      </w:r>
-      <w:r>
-        <w:rPr>
-          <w:rStyle w:val="VerbatimChar"/>
-        </w:rPr>
-        <w:t xml:space="preserve">│         Logical Plan → Physical Plan                     │</w:t>
-      </w:r>
-      <w:r>
-        <w:br/>
-      </w:r>
-      <w:r>
-        <w:rPr>
-          <w:rStyle w:val="VerbatimChar"/>
-        </w:rPr>
-        <w:t xml:space="preserve">│         </w:t>
-      </w:r>
-      <w:r>
-        <w:rPr>
-          <w:rStyle w:val="VerbatimChar"/>
-          <w:rFonts w:hint="eastAsia"/>
-        </w:rPr>
-        <w:t xml:space="preserve">功能：查询优化、执行计划生成</w:t>
-      </w:r>
-      <w:r>
-        <w:rPr>
-          <w:rStyle w:val="VerbatimChar"/>
-        </w:rPr>
-        <w:t xml:space="preserve">                      │</w:t>
-      </w:r>
-      <w:r>
-        <w:br/>
-      </w:r>
-      <w:r>
-        <w:rPr>
-          <w:rStyle w:val="VerbatimChar"/>
-        </w:rPr>
-        <w:t xml:space="preserve">└─────────────────────────────────────────────────────────┘</w:t>
-      </w:r>
-      <w:r>
-        <w:br/>
-      </w:r>
-      <w:r>
-        <w:rPr>
-          <w:rStyle w:val="VerbatimChar"/>
-        </w:rPr>
-        <w:t xml:space="preserve">                          ↓</w:t>
-      </w:r>
-      <w:r>
-        <w:br/>
-      </w:r>
-      <w:r>
-        <w:rPr>
-          <w:rStyle w:val="VerbatimChar"/>
-        </w:rPr>
-        <w:t xml:space="preserve">┌─────────────────────────────────────────────────────────┐</w:t>
-      </w:r>
-      <w:r>
-        <w:br/>
-      </w:r>
-      <w:r>
-        <w:rPr>
-          <w:rStyle w:val="VerbatimChar"/>
-        </w:rPr>
-        <w:t xml:space="preserve">│                    Executor Layer                        │</w:t>
-      </w:r>
-      <w:r>
-        <w:br/>
-      </w:r>
-      <w:r>
-        <w:rPr>
-          <w:rStyle w:val="VerbatimChar"/>
-        </w:rPr>
-        <w:t xml:space="preserve">│         Volcano Model → Operators                        │</w:t>
-      </w:r>
-      <w:r>
-        <w:br/>
-      </w:r>
-      <w:r>
-        <w:rPr>
-          <w:rStyle w:val="VerbatimChar"/>
-        </w:rPr>
-        <w:t xml:space="preserve">│         </w:t>
-      </w:r>
-      <w:r>
-        <w:rPr>
-          <w:rStyle w:val="VerbatimChar"/>
-          <w:rFonts w:hint="eastAsia"/>
-        </w:rPr>
-        <w:t xml:space="preserve">功能：查询执行、结果返回</w:t>
-      </w:r>
-      <w:r>
-        <w:rPr>
-          <w:rStyle w:val="VerbatimChar"/>
-        </w:rPr>
-        <w:t xml:space="preserve">                          │</w:t>
-      </w:r>
-      <w:r>
-        <w:br/>
-      </w:r>
-      <w:r>
-        <w:rPr>
-          <w:rStyle w:val="VerbatimChar"/>
-        </w:rPr>
-        <w:t xml:space="preserve">└─────────────────────────────────────────────────────────┘</w:t>
-      </w:r>
-      <w:r>
-        <w:br/>
-      </w:r>
-      <w:r>
-        <w:rPr>
-          <w:rStyle w:val="VerbatimChar"/>
-        </w:rPr>
-        <w:t xml:space="preserve">                          ↓</w:t>
-      </w:r>
-      <w:r>
-        <w:br/>
-      </w:r>
-      <w:r>
-        <w:rPr>
-          <w:rStyle w:val="VerbatimChar"/>
-        </w:rPr>
-        <w:t xml:space="preserve">┌─────────────────────────────────────────────────────────┐</w:t>
-      </w:r>
-      <w:r>
-        <w:br/>
-      </w:r>
-      <w:r>
-        <w:rPr>
-          <w:rStyle w:val="VerbatimChar"/>
-        </w:rPr>
-        <w:t xml:space="preserve">│                    Storage Layer                         │</w:t>
-      </w:r>
-      <w:r>
-        <w:br/>
-      </w:r>
-      <w:r>
-        <w:rPr>
-          <w:rStyle w:val="VerbatimChar"/>
-        </w:rPr>
-        <w:t xml:space="preserve">│         Page → BufferPool → B+Tree → WAL                 │</w:t>
-      </w:r>
-      <w:r>
-        <w:br/>
-      </w:r>
-      <w:r>
-        <w:rPr>
-          <w:rStyle w:val="VerbatimChar"/>
-        </w:rPr>
-        <w:t xml:space="preserve">│         </w:t>
-      </w:r>
-      <w:r>
-        <w:rPr>
-          <w:rStyle w:val="VerbatimChar"/>
-          <w:rFonts w:hint="eastAsia"/>
-        </w:rPr>
-        <w:t xml:space="preserve">功能：数据存储、索引管理、事务支持</w:t>
-      </w:r>
-      <w:r>
-        <w:rPr>
-          <w:rStyle w:val="VerbatimChar"/>
-        </w:rPr>
-        <w:t xml:space="preserve">                │</w:t>
-      </w:r>
-      <w:r>
-        <w:br/>
-      </w:r>
-      <w:r>
-        <w:rPr>
-          <w:rStyle w:val="VerbatimChar"/>
-        </w:rPr>
-        <w:t xml:space="preserve">└─────────────────────────────────────────────────────────┘</w:t>
+        <w:t xml:space="preserve">flowchart TB</w:t>
+      </w:r>
+      <w:r>
+        <w:br/>
+      </w:r>
+      <w:r>
+        <w:rPr>
+          <w:rStyle w:val="VerbatimChar"/>
+        </w:rPr>
+        <w:t xml:space="preserve">    subgraph Parser["Parser Layer"]</w:t>
+      </w:r>
+      <w:r>
+        <w:br/>
+      </w:r>
+      <w:r>
+        <w:rPr>
+          <w:rStyle w:val="VerbatimChar"/>
+        </w:rPr>
+        <w:t xml:space="preserve">        L[Lexer]</w:t>
+      </w:r>
+      <w:r>
+        <w:br/>
+      </w:r>
+      <w:r>
+        <w:rPr>
+          <w:rStyle w:val="VerbatimChar"/>
+        </w:rPr>
+        <w:t xml:space="preserve">        P[Parser]</w:t>
+      </w:r>
+      <w:r>
+        <w:br/>
+      </w:r>
+      <w:r>
+        <w:rPr>
+          <w:rStyle w:val="VerbatimChar"/>
+        </w:rPr>
+        <w:t xml:space="preserve">        A[AST]</w:t>
+      </w:r>
+      <w:r>
+        <w:br/>
+      </w:r>
+      <w:r>
+        <w:rPr>
+          <w:rStyle w:val="VerbatimChar"/>
+        </w:rPr>
+        <w:t xml:space="preserve">        L --&gt; P --&gt; A</w:t>
+      </w:r>
+      <w:r>
+        <w:br/>
+      </w:r>
+      <w:r>
+        <w:rPr>
+          <w:rStyle w:val="VerbatimChar"/>
+        </w:rPr>
+        <w:t xml:space="preserve">    end</w:t>
+      </w:r>
+      <w:r>
+        <w:br/>
+      </w:r>
+      <w:r>
+        <w:br/>
+      </w:r>
+      <w:r>
+        <w:rPr>
+          <w:rStyle w:val="VerbatimChar"/>
+        </w:rPr>
+        <w:t xml:space="preserve">    subgraph Planner["Planner Layer"]</w:t>
+      </w:r>
+      <w:r>
+        <w:br/>
+      </w:r>
+      <w:r>
+        <w:rPr>
+          <w:rStyle w:val="VerbatimChar"/>
+        </w:rPr>
+        <w:t xml:space="preserve">        LP[Logical Plan]</w:t>
+      </w:r>
+      <w:r>
+        <w:br/>
+      </w:r>
+      <w:r>
+        <w:rPr>
+          <w:rStyle w:val="VerbatimChar"/>
+        </w:rPr>
+        <w:t xml:space="preserve">        PP[Physical Plan]</w:t>
+      </w:r>
+      <w:r>
+        <w:br/>
+      </w:r>
+      <w:r>
+        <w:rPr>
+          <w:rStyle w:val="VerbatimChar"/>
+        </w:rPr>
+        <w:t xml:space="preserve">        LP --&gt; PP</w:t>
+      </w:r>
+      <w:r>
+        <w:br/>
+      </w:r>
+      <w:r>
+        <w:rPr>
+          <w:rStyle w:val="VerbatimChar"/>
+        </w:rPr>
+        <w:t xml:space="preserve">    end</w:t>
+      </w:r>
+      <w:r>
+        <w:br/>
+      </w:r>
+      <w:r>
+        <w:br/>
+      </w:r>
+      <w:r>
+        <w:rPr>
+          <w:rStyle w:val="VerbatimChar"/>
+        </w:rPr>
+        <w:t xml:space="preserve">    subgraph Executor["Executor Layer"]</w:t>
+      </w:r>
+      <w:r>
+        <w:br/>
+      </w:r>
+      <w:r>
+        <w:rPr>
+          <w:rStyle w:val="VerbatimChar"/>
+        </w:rPr>
+        <w:t xml:space="preserve">        E[Executor]</w:t>
+      </w:r>
+      <w:r>
+        <w:br/>
+      </w:r>
+      <w:r>
+        <w:rPr>
+          <w:rStyle w:val="VerbatimChar"/>
+        </w:rPr>
+        <w:t xml:space="preserve">        O[Operators]</w:t>
+      </w:r>
+      <w:r>
+        <w:br/>
+      </w:r>
+      <w:r>
+        <w:rPr>
+          <w:rStyle w:val="VerbatimChar"/>
+        </w:rPr>
+        <w:t xml:space="preserve">        E --&gt; O</w:t>
+      </w:r>
+      <w:r>
+        <w:br/>
+      </w:r>
+      <w:r>
+        <w:rPr>
+          <w:rStyle w:val="VerbatimChar"/>
+        </w:rPr>
+        <w:t xml:space="preserve">    end</w:t>
+      </w:r>
+      <w:r>
+        <w:br/>
+      </w:r>
+      <w:r>
+        <w:br/>
+      </w:r>
+      <w:r>
+        <w:rPr>
+          <w:rStyle w:val="VerbatimChar"/>
+        </w:rPr>
+        <w:t xml:space="preserve">    subgraph Storage["Storage Layer"]</w:t>
+      </w:r>
+      <w:r>
+        <w:br/>
+      </w:r>
+      <w:r>
+        <w:rPr>
+          <w:rStyle w:val="VerbatimChar"/>
+        </w:rPr>
+        <w:t xml:space="preserve">        B[B+Tree]</w:t>
+      </w:r>
+      <w:r>
+        <w:br/>
+      </w:r>
+      <w:r>
+        <w:rPr>
+          <w:rStyle w:val="VerbatimChar"/>
+        </w:rPr>
+        <w:t xml:space="preserve">        W[WAL]</w:t>
+      </w:r>
+      <w:r>
+        <w:br/>
+      </w:r>
+      <w:r>
+        <w:rPr>
+          <w:rStyle w:val="VerbatimChar"/>
+        </w:rPr>
+        <w:t xml:space="preserve">        Buf[BufferPool]</w:t>
+      </w:r>
+      <w:r>
+        <w:br/>
+      </w:r>
+      <w:r>
+        <w:rPr>
+          <w:rStyle w:val="VerbatimChar"/>
+        </w:rPr>
+        <w:t xml:space="preserve">        Buf --&gt; B</w:t>
+      </w:r>
+      <w:r>
+        <w:br/>
+      </w:r>
+      <w:r>
+        <w:rPr>
+          <w:rStyle w:val="VerbatimChar"/>
+        </w:rPr>
+        <w:t xml:space="preserve">        Buf --&gt; W</w:t>
+      </w:r>
+      <w:r>
+        <w:br/>
+      </w:r>
+      <w:r>
+        <w:rPr>
+          <w:rStyle w:val="VerbatimChar"/>
+        </w:rPr>
+        <w:t xml:space="preserve">    end</w:t>
+      </w:r>
+      <w:r>
+        <w:br/>
+      </w:r>
+      <w:r>
+        <w:br/>
+      </w:r>
+      <w:r>
+        <w:rPr>
+          <w:rStyle w:val="VerbatimChar"/>
+        </w:rPr>
+        <w:t xml:space="preserve">    Parser --&gt; Planner --&gt; Executor --&gt; Storage</w:t>
       </w:r>
     </w:p>
     <w:p>

</xml_diff>